<commit_message>
LMM: sleep controlled only in fatigue model (option C), sleep-in-all as sensitivity; HRV windows >=95% clean
Co-Authored-By: Claude Opus 5.5 <noreply@anthropic.com>
</commit_message>
<xml_diff>
--- a/results/LMM/LMM 分析結果.docx
+++ b/results/LMM/LMM 分析結果.docx
@@ -1323,7 +1323,7 @@
                 <w:color w:val="17212B"/>
                 <w:sz w:val="19"/>
               </w:rPr>
-              <w:t>94 人次</w:t>
+              <w:t>116 人次</w:t>
             </w:r>
           </w:p>
         </w:tc>
@@ -1344,7 +1344,7 @@
                 <w:color w:val="17212B"/>
                 <w:sz w:val="19"/>
               </w:rPr>
-              <w:t>11 人</w:t>
+              <w:t>12 人</w:t>
             </w:r>
           </w:p>
         </w:tc>
@@ -1365,7 +1365,7 @@
                 <w:color w:val="17212B"/>
                 <w:sz w:val="19"/>
               </w:rPr>
-              <w:t>沒填疲勞量表就沒有睡眠資料；09-17 沒有 CO₂</w:t>
+              <w:t>09-17 沒有 CO₂；少數人在感測器沒收錄的時間施測</w:t>
             </w:r>
           </w:p>
         </w:tc>
@@ -1433,7 +1433,7 @@
                 <w:color w:val="17212B"/>
                 <w:sz w:val="19"/>
               </w:rPr>
-              <w:t>94 人次</w:t>
+              <w:t>116 人次</w:t>
             </w:r>
           </w:p>
         </w:tc>
@@ -1454,7 +1454,7 @@
                 <w:color w:val="17212B"/>
                 <w:sz w:val="19"/>
               </w:rPr>
-              <w:t>11 人</w:t>
+              <w:t>12 人</w:t>
             </w:r>
           </w:p>
         </w:tc>
@@ -1543,7 +1543,7 @@
                 <w:color w:val="17212B"/>
                 <w:sz w:val="19"/>
               </w:rPr>
-              <w:t>94 人次</w:t>
+              <w:t>116 人次</w:t>
             </w:r>
           </w:p>
         </w:tc>
@@ -1564,7 +1564,7 @@
                 <w:color w:val="17212B"/>
                 <w:sz w:val="19"/>
               </w:rPr>
-              <w:t>11 人</w:t>
+              <w:t>12 人</w:t>
             </w:r>
           </w:p>
         </w:tc>
@@ -1653,7 +1653,7 @@
                 <w:color w:val="17212B"/>
                 <w:sz w:val="19"/>
               </w:rPr>
-              <w:t>355 筆（5 分鐘）</w:t>
+              <w:t>543 筆（5 分鐘）</w:t>
             </w:r>
           </w:p>
         </w:tc>
@@ -1674,7 +1674,7 @@
                 <w:color w:val="17212B"/>
                 <w:sz w:val="19"/>
               </w:rPr>
-              <w:t>10 人</w:t>
+              <w:t>12 人</w:t>
             </w:r>
           </w:p>
         </w:tc>
@@ -1695,7 +1695,7 @@
                 <w:color w:val="17212B"/>
                 <w:sz w:val="19"/>
               </w:rPr>
-              <w:t>沒填量表的節次缺睡眠；09-17 沒有 CO₂</w:t>
+              <w:t>09-17 沒有 CO₂</w:t>
             </w:r>
           </w:p>
         </w:tc>
@@ -1740,7 +1740,7 @@
                 <w:color w:val="17212B"/>
                 <w:sz w:val="19"/>
               </w:rPr>
-              <w:t>197 筆（5 分鐘）</w:t>
+              <w:t>85 筆（5 分鐘）</w:t>
             </w:r>
           </w:p>
         </w:tc>
@@ -1760,7 +1760,7 @@
                 <w:color w:val="17212B"/>
                 <w:sz w:val="19"/>
               </w:rPr>
-              <w:t>131 筆（5 分鐘）</w:t>
+              <w:t>85 筆（5 分鐘）</w:t>
             </w:r>
           </w:p>
         </w:tc>
@@ -1780,7 +1780,7 @@
                 <w:color w:val="17212B"/>
                 <w:sz w:val="19"/>
               </w:rPr>
-              <w:t>5 人</w:t>
+              <w:t>6 人</w:t>
             </w:r>
           </w:p>
         </w:tc>
@@ -1800,7 +1800,7 @@
                 <w:color w:val="17212B"/>
                 <w:sz w:val="19"/>
               </w:rPr>
-              <w:t>只有心電貼片能算；缺睡眠</w:t>
+              <w:t>只有心電貼片能算，且只用乾淨心跳 ≥ 95% 的時段</w:t>
             </w:r>
           </w:p>
         </w:tc>
@@ -1823,7 +1823,7 @@
           <w:color w:val="17212B"/>
           <w:sz w:val="21"/>
         </w:rPr>
-        <w:t>・疲勞量表排除注意力檢核題未通過的問卷（7 份，皆為同一位學生），所以疲勞與睡眠只有 11 人。</w:t>
+        <w:t>・疲勞量表排除注意力檢核題未通過的問卷（7 份，皆為同一位學生），所以疲勞程度只有 11 人。</w:t>
       </w:r>
     </w:p>
     <w:p>
@@ -1853,7 +1853,7 @@
           <w:color w:val="17212B"/>
           <w:sz w:val="21"/>
         </w:rPr>
-        <w:t>・心率變異度只能用心電貼片的逐拍資料計算（手環只輸出平滑過的心率），且只用乾淨心跳 ≥ 80% 的 5 分鐘時段，所以只有 5 位學生。</w:t>
+        <w:t>・心率變異度只能用心電貼片的逐拍資料計算（手環只輸出平滑過的心率）。每 5 分鐘時段的乾淨心跳須 ≥ 95%（異常心跳 ≤ 5%，依 HRV 分析軟體 Kubios 開發者的建議），並剔除相鄰兩拍 RR 間隔相差超過 20% 的差值（Malik 準則），所以只有 6 位學生。</w:t>
       </w:r>
     </w:p>
     <w:p>
@@ -1938,12 +1938,12 @@
           <w:color w:val="17212B"/>
           <w:sz w:val="22"/>
         </w:rPr>
-        <w:t>六個依變量各建一個模型，三個自變量與四個控制變因同時放入：</w:t>
+        <w:t>六個依變量各建一個模型，三個自變量與控制變因同時放入：</w:t>
       </w:r>
     </w:p>
     <w:p>
       <w:pPr>
-        <w:spacing w:before="0" w:after="80" w:line="340" w:lineRule="exact"/>
+        <w:spacing w:before="0" w:after="40" w:line="340" w:lineRule="exact"/>
         <w:jc w:val="center"/>
       </w:pPr>
       <w:r>
@@ -1951,9 +1951,57 @@
           <w:rFonts w:ascii="Times New Roman" w:hAnsi="Times New Roman" w:cs="Times New Roman" w:eastAsia="標楷體"/>
           <w:b w:val="0"/>
           <w:color w:val="17212B"/>
-          <w:sz w:val="22"/>
+          <w:sz w:val="21"/>
         </w:rPr>
-        <w:t>依變量 ＝ CO₂ ＋ 溫度 ＋ 濕度 ＋ 人數 ＋ 冷氣 ＋ 睡眠時長 ＋ 睡眠品質 ＋（學生隨機截距）</w:t>
+        <w:t>疲勞程度 ＝ CO₂ ＋ 溫度 ＋ 濕度 ＋ 人數 ＋ 冷氣 ＋ 睡眠時長 ＋ 睡眠品質 ＋（學生隨機截距）</w:t>
+      </w:r>
+    </w:p>
+    <w:p>
+      <w:pPr>
+        <w:spacing w:before="0" w:after="40" w:line="340" w:lineRule="exact"/>
+        <w:jc w:val="center"/>
+      </w:pPr>
+      <w:r>
+        <w:rPr>
+          <w:rFonts w:ascii="Times New Roman" w:hAnsi="Times New Roman" w:cs="Times New Roman" w:eastAsia="標楷體"/>
+          <w:b w:val="0"/>
+          <w:color w:val="17212B"/>
+          <w:sz w:val="21"/>
+        </w:rPr>
+        <w:t>其他五個依變量 ＝ CO₂ ＋ 溫度 ＋ 濕度 ＋ 人數 ＋ 冷氣 ＋（學生隨機截距）</w:t>
+      </w:r>
+    </w:p>
+    <w:p>
+      <w:pPr>
+        <w:spacing w:before="0" w:after="40" w:line="340" w:lineRule="exact"/>
+        <w:ind w:left="340" w:hanging="227"/>
+      </w:pPr>
+      <w:r>
+        <w:rPr>
+          <w:rFonts w:ascii="Times New Roman" w:hAnsi="Times New Roman" w:cs="Times New Roman" w:eastAsia="標楷體"/>
+          <w:b w:val="0"/>
+          <w:color w:val="17212B"/>
+          <w:sz w:val="21"/>
+        </w:rPr>
+        <w:t>・</w:t>
+      </w:r>
+      <w:r>
+        <w:rPr>
+          <w:rFonts w:ascii="Times New Roman" w:hAnsi="Times New Roman" w:cs="Times New Roman" w:eastAsia="標楷體"/>
+          <w:b/>
+          <w:color w:val="17212B"/>
+          <w:sz w:val="21"/>
+        </w:rPr>
+        <w:t>睡眠只放在疲勞模型</w:t>
+      </w:r>
+      <w:r>
+        <w:rPr>
+          <w:rFonts w:ascii="Times New Roman" w:hAnsi="Times New Roman" w:cs="Times New Roman" w:eastAsia="標楷體"/>
+          <w:b w:val="0"/>
+          <w:color w:val="17212B"/>
+          <w:sz w:val="21"/>
+        </w:rPr>
+        <w:t>：睡眠資料來自疲勞量表，若其他模型也控制睡眠，沒填量表的學生就會被整個排除（Stroop 會少 1 人、心率少 2 人）。為了納入所有學生，其他模型不控制睡眠；「每個模型都控制睡眠」的結果列在第六節的敏感度分析。</w:t>
       </w:r>
     </w:p>
     <w:p>
@@ -2059,7 +2107,7 @@
           <w:color w:val="17212B"/>
           <w:sz w:val="22"/>
         </w:rPr>
-        <w:t>表 2　三個自變量的係數（已控制其他兩個自變量與四個控制變因）。括號內為 95% 信賴區間，</w:t>
+        <w:t>表 2　三個自變量的係數（已控制其他兩個自變量與控制變因）。括號內為 95% 信賴區間，</w:t>
       </w:r>
       <w:r>
         <w:rPr>
@@ -2329,15 +2377,40 @@
             <w:r>
               <w:rPr>
                 <w:rFonts w:ascii="Times New Roman" w:hAnsi="Times New Roman" w:cs="Times New Roman" w:eastAsia="標楷體"/>
-                <w:b w:val="0"/>
+                <w:b/>
                 <w:color w:val="17212B"/>
                 <w:sz w:val="19"/>
               </w:rPr>
-              <w:t>+3.7</w:t>
+              <w:t>+4.5</w:t>
               <w:br/>
-              <w:t>(-0.7, +8.1)</w:t>
+              <w:t>(+0.3, +8.8)</w:t>
               <w:br/>
-              <w:t>p = .103</w:t>
+              <w:t>p = .035</w:t>
+            </w:r>
+          </w:p>
+        </w:tc>
+        <w:tc>
+          <w:tcPr>
+            <w:tcW w:type="dxa" w:w="2438"/>
+          </w:tcPr>
+          <w:p>
+            <w:pPr>
+              <w:keepNext/>
+              <w:spacing w:before="0" w:after="0" w:line="260" w:lineRule="exact"/>
+              <w:jc w:val="center"/>
+            </w:pPr>
+            <w:r>
+              <w:rPr>
+                <w:rFonts w:ascii="Times New Roman" w:hAnsi="Times New Roman" w:cs="Times New Roman" w:eastAsia="標楷體"/>
+                <w:b/>
+                <w:color w:val="17212B"/>
+                <w:sz w:val="19"/>
+              </w:rPr>
+              <w:t>+53.9</w:t>
+              <w:br/>
+              <w:t>(+6.5, +101.3)</w:t>
+              <w:br/>
+              <w:t>p = .026</w:t>
             </w:r>
           </w:p>
         </w:tc>
@@ -2358,36 +2431,11 @@
                 <w:color w:val="17212B"/>
                 <w:sz w:val="19"/>
               </w:rPr>
-              <w:t>+38.7</w:t>
+              <w:t>-0.2</w:t>
               <w:br/>
-              <w:t>(-10.6, +87.9)</w:t>
+              <w:t>(-4.7, +4.4)</w:t>
               <w:br/>
-              <w:t>p = .124</w:t>
-            </w:r>
-          </w:p>
-        </w:tc>
-        <w:tc>
-          <w:tcPr>
-            <w:tcW w:type="dxa" w:w="2438"/>
-          </w:tcPr>
-          <w:p>
-            <w:pPr>
-              <w:keepNext/>
-              <w:spacing w:before="0" w:after="0" w:line="260" w:lineRule="exact"/>
-              <w:jc w:val="center"/>
-            </w:pPr>
-            <w:r>
-              <w:rPr>
-                <w:rFonts w:ascii="Times New Roman" w:hAnsi="Times New Roman" w:cs="Times New Roman" w:eastAsia="標楷體"/>
-                <w:b w:val="0"/>
-                <w:color w:val="17212B"/>
-                <w:sz w:val="19"/>
-              </w:rPr>
-              <w:t>+0.5</w:t>
-              <w:br/>
-              <w:t>(-4.4, +5.4)</w:t>
-              <w:br/>
-              <w:t>p = .831</w:t>
+              <w:t>p = .941</w:t>
             </w:r>
           </w:p>
         </w:tc>
@@ -2436,11 +2484,11 @@
                 <w:color w:val="17212B"/>
                 <w:sz w:val="19"/>
               </w:rPr>
-              <w:t>+0.002</w:t>
+              <w:t>+0.003</w:t>
               <w:br/>
-              <w:t>(-0.003, +0.007)</w:t>
+              <w:t>(-0.001, +0.008)</w:t>
               <w:br/>
-              <w:t>p = .417</w:t>
+              <w:t>p = .151</w:t>
             </w:r>
           </w:p>
         </w:tc>
@@ -2461,11 +2509,11 @@
                 <w:color w:val="17212B"/>
                 <w:sz w:val="19"/>
               </w:rPr>
-              <w:t>+0.045</w:t>
+              <w:t>+0.038</w:t>
               <w:br/>
-              <w:t>(-0.012, +0.101)</w:t>
+              <w:t>(-0.011, +0.088)</w:t>
               <w:br/>
-              <w:t>p = .122</w:t>
+              <w:t>p = .130</w:t>
             </w:r>
           </w:p>
         </w:tc>
@@ -2488,9 +2536,9 @@
               </w:rPr>
               <w:t>+0.002</w:t>
               <w:br/>
-              <w:t>(-0.003, +0.008)</w:t>
+              <w:t>(-0.003, +0.007)</w:t>
               <w:br/>
-              <w:t>p = .394</w:t>
+              <w:t>p = .432</w:t>
             </w:r>
           </w:p>
         </w:tc>
@@ -2539,36 +2587,11 @@
                 <w:color w:val="17212B"/>
                 <w:sz w:val="19"/>
               </w:rPr>
-              <w:t>-1.5</w:t>
+              <w:t>+0.4</w:t>
               <w:br/>
-              <w:t>(-6.7, +3.7)</w:t>
+              <w:t>(-5.6, +6.4)</w:t>
               <w:br/>
-              <w:t>p = .575</w:t>
-            </w:r>
-          </w:p>
-        </w:tc>
-        <w:tc>
-          <w:tcPr>
-            <w:tcW w:type="dxa" w:w="2438"/>
-          </w:tcPr>
-          <w:p>
-            <w:pPr>
-              <w:keepNext/>
-              <w:spacing w:before="0" w:after="0" w:line="260" w:lineRule="exact"/>
-              <w:jc w:val="center"/>
-            </w:pPr>
-            <w:r>
-              <w:rPr>
-                <w:rFonts w:ascii="Times New Roman" w:hAnsi="Times New Roman" w:cs="Times New Roman" w:eastAsia="標楷體"/>
-                <w:b/>
-                <w:color w:val="17212B"/>
-                <w:sz w:val="19"/>
-              </w:rPr>
-              <w:t>-66.8</w:t>
-              <w:br/>
-              <w:t>(-125.9, -7.7)</w:t>
-              <w:br/>
-              <w:t>p = .027</w:t>
+              <w:t>p = .897</w:t>
             </w:r>
           </w:p>
         </w:tc>
@@ -2589,11 +2612,36 @@
                 <w:color w:val="17212B"/>
                 <w:sz w:val="19"/>
               </w:rPr>
-              <w:t>-2.2</w:t>
+              <w:t>-18.2</w:t>
               <w:br/>
-              <w:t>(-8.1, +3.7)</w:t>
+              <w:t>(-86.0, +49.6)</w:t>
               <w:br/>
-              <w:t>p = .472</w:t>
+              <w:t>p = .599</w:t>
+            </w:r>
+          </w:p>
+        </w:tc>
+        <w:tc>
+          <w:tcPr>
+            <w:tcW w:type="dxa" w:w="2438"/>
+          </w:tcPr>
+          <w:p>
+            <w:pPr>
+              <w:keepNext/>
+              <w:spacing w:before="0" w:after="0" w:line="260" w:lineRule="exact"/>
+              <w:jc w:val="center"/>
+            </w:pPr>
+            <w:r>
+              <w:rPr>
+                <w:rFonts w:ascii="Times New Roman" w:hAnsi="Times New Roman" w:cs="Times New Roman" w:eastAsia="標楷體"/>
+                <w:b w:val="0"/>
+                <w:color w:val="17212B"/>
+                <w:sz w:val="19"/>
+              </w:rPr>
+              <w:t>-0.6</w:t>
+              <w:br/>
+              <w:t>(-7.2, +5.9)</w:t>
+              <w:br/>
+              <w:t>p = .857</w:t>
             </w:r>
           </w:p>
         </w:tc>
@@ -2642,11 +2690,11 @@
                 <w:color w:val="17212B"/>
                 <w:sz w:val="19"/>
               </w:rPr>
-              <w:t>-0.2</w:t>
+              <w:t>-0.1</w:t>
               <w:br/>
-              <w:t>(-0.6, +0.1)</w:t>
+              <w:t>(-0.4, +0.1)</w:t>
               <w:br/>
-              <w:t>p = .169</w:t>
+              <w:t>p = .308</w:t>
             </w:r>
           </w:p>
         </w:tc>
@@ -2667,9 +2715,9 @@
                 <w:color w:val="17212B"/>
                 <w:sz w:val="19"/>
               </w:rPr>
-              <w:t>-4.0</w:t>
+              <w:t>-3.3</w:t>
               <w:br/>
-              <w:t>(-5.7, -2.3)</w:t>
+              <w:t>(-4.6, -2.0)</w:t>
               <w:br/>
               <w:t>p = &lt; .001</w:t>
             </w:r>
@@ -2694,7 +2742,7 @@
               </w:rPr>
               <w:t>+0.6</w:t>
               <w:br/>
-              <w:t>(+0.3, +0.9)</w:t>
+              <w:t>(+0.4, +0.9)</w:t>
               <w:br/>
               <w:t>p = &lt; .001</w:t>
             </w:r>
@@ -2739,15 +2787,15 @@
             <w:r>
               <w:rPr>
                 <w:rFonts w:ascii="Times New Roman" w:hAnsi="Times New Roman" w:cs="Times New Roman" w:eastAsia="標楷體"/>
-                <w:b w:val="0"/>
+                <w:b/>
                 <w:color w:val="17212B"/>
                 <w:sz w:val="19"/>
               </w:rPr>
-              <w:t>+0.016</w:t>
+              <w:t>-0.128</w:t>
               <w:br/>
-              <w:t>(-0.017, +0.048)</w:t>
+              <w:t>(-0.185, -0.071)</w:t>
               <w:br/>
-              <w:t>p = .340</w:t>
+              <w:t>p = &lt; .001</w:t>
             </w:r>
           </w:p>
         </w:tc>
@@ -2767,11 +2815,11 @@
                 <w:color w:val="17212B"/>
                 <w:sz w:val="19"/>
               </w:rPr>
-              <w:t>+0.184</w:t>
+              <w:t>+0.258</w:t>
               <w:br/>
-              <w:t>(+0.031, +0.336)</w:t>
+              <w:t>(+0.004, +0.512)</w:t>
               <w:br/>
-              <w:t>p = .018</w:t>
+              <w:t>p = .047</w:t>
             </w:r>
           </w:p>
         </w:tc>
@@ -2787,15 +2835,15 @@
             <w:r>
               <w:rPr>
                 <w:rFonts w:ascii="Times New Roman" w:hAnsi="Times New Roman" w:cs="Times New Roman" w:eastAsia="標楷體"/>
-                <w:b w:val="0"/>
+                <w:b/>
                 <w:color w:val="17212B"/>
                 <w:sz w:val="19"/>
               </w:rPr>
-              <w:t>+0.002</w:t>
+              <w:t>-0.101</w:t>
               <w:br/>
-              <w:t>(-0.028, +0.033)</w:t>
+              <w:t>(-0.157, -0.044)</w:t>
               <w:br/>
-              <w:t>p = .882</w:t>
+              <w:t>p = &lt; .001</w:t>
             </w:r>
           </w:p>
         </w:tc>
@@ -2817,7 +2865,7 @@
           <w:color w:val="5B6670"/>
           <w:sz w:val="19"/>
         </w:rPr>
-        <w:t>心率變異度為 log(RMSSD)：係數 × 100 約等於 RMSSD 變化的百分比（例如 +0.18 ≈ +20%）。</w:t>
+        <w:t>心率變異度為 log(RMSSD)：係數 b 代表 RMSSD 變化約 (e^b − 1) × 100%（例如 −0.128 ≈ −12%）。</w:t>
       </w:r>
     </w:p>
     <w:p>
@@ -3090,7 +3138,7 @@
                 <w:color w:val="17212B"/>
                 <w:sz w:val="19"/>
               </w:rPr>
-              <w:t>-4.0（-6.8, -1.3）</w:t>
+              <w:t>-2.9（-4.9, -0.9）</w:t>
             </w:r>
           </w:p>
         </w:tc>
@@ -3110,7 +3158,7 @@
                 <w:color w:val="17212B"/>
                 <w:sz w:val="19"/>
               </w:rPr>
-              <w:t>.004</w:t>
+              <w:t>.005</w:t>
             </w:r>
           </w:p>
         </w:tc>
@@ -3130,7 +3178,7 @@
       <w:r>
         <w:drawing>
           <wp:inline xmlns:a="http://schemas.openxmlformats.org/drawingml/2006/main" xmlns:pic="http://schemas.openxmlformats.org/drawingml/2006/picture">
-            <wp:extent cx="5760000" cy="3159723"/>
+            <wp:extent cx="5760000" cy="3159060"/>
             <wp:docPr id="2" name="Picture 2"/>
             <wp:cNvGraphicFramePr>
               <a:graphicFrameLocks noChangeAspect="1"/>
@@ -3151,7 +3199,7 @@
                   <pic:spPr>
                     <a:xfrm>
                       <a:off x="0" y="0"/>
-                      <a:ext cx="5760000" cy="3159723"/>
+                      <a:ext cx="5760000" cy="3159060"/>
                     </a:xfrm>
                     <a:prstGeom prst="rect"/>
                   </pic:spPr>
@@ -3173,7 +3221,7 @@
           <w:color w:val="5B6670"/>
           <w:sz w:val="19"/>
         </w:rPr>
-        <w:t>圖 2　六個 LMM 的標準化係數。上方三列（彩色）為自變量，下方四列（灰色）為控制變因；線為 95% 信賴區間，實心點為 p &lt; .05。</w:t>
+        <w:t>圖 2　六個 LMM 的標準化係數。上方三列（彩色）為自變量，下方為控制變因（灰色；睡眠只在疲勞模型）；線為 95% 信賴區間，實心點為 p &lt; .05。</w:t>
       </w:r>
     </w:p>
     <w:p>
@@ -3472,7 +3520,7 @@
                 <w:color w:val="17212B"/>
                 <w:sz w:val="19"/>
               </w:rPr>
-              <w:t>94</w:t>
+              <w:t>116</w:t>
             </w:r>
           </w:p>
         </w:tc>
@@ -3493,7 +3541,7 @@
                 <w:color w:val="17212B"/>
                 <w:sz w:val="19"/>
               </w:rPr>
-              <w:t>11</w:t>
+              <w:t>12</w:t>
             </w:r>
           </w:p>
         </w:tc>
@@ -3535,7 +3583,7 @@
                 <w:color w:val="17212B"/>
                 <w:sz w:val="19"/>
               </w:rPr>
-              <w:t>0.62</w:t>
+              <w:t>0.58</w:t>
             </w:r>
           </w:p>
         </w:tc>
@@ -3582,7 +3630,7 @@
                 <w:color w:val="17212B"/>
                 <w:sz w:val="19"/>
               </w:rPr>
-              <w:t>94</w:t>
+              <w:t>116</w:t>
             </w:r>
           </w:p>
         </w:tc>
@@ -3603,7 +3651,7 @@
                 <w:color w:val="17212B"/>
                 <w:sz w:val="19"/>
               </w:rPr>
-              <w:t>11</w:t>
+              <w:t>12</w:t>
             </w:r>
           </w:p>
         </w:tc>
@@ -3624,7 +3672,7 @@
                 <w:color w:val="17212B"/>
                 <w:sz w:val="19"/>
               </w:rPr>
-              <w:t>0.04</w:t>
+              <w:t>0.03</w:t>
             </w:r>
           </w:p>
         </w:tc>
@@ -3645,7 +3693,7 @@
                 <w:color w:val="17212B"/>
                 <w:sz w:val="19"/>
               </w:rPr>
-              <w:t>0.16</w:t>
+              <w:t>0.14</w:t>
             </w:r>
           </w:p>
         </w:tc>
@@ -3692,7 +3740,7 @@
                 <w:color w:val="17212B"/>
                 <w:sz w:val="19"/>
               </w:rPr>
-              <w:t>94</w:t>
+              <w:t>116</w:t>
             </w:r>
           </w:p>
         </w:tc>
@@ -3713,7 +3761,7 @@
                 <w:color w:val="17212B"/>
                 <w:sz w:val="19"/>
               </w:rPr>
-              <w:t>11</w:t>
+              <w:t>12</w:t>
             </w:r>
           </w:p>
         </w:tc>
@@ -3734,7 +3782,7 @@
                 <w:color w:val="17212B"/>
                 <w:sz w:val="19"/>
               </w:rPr>
-              <w:t>0.15</w:t>
+              <w:t>0.03</w:t>
             </w:r>
           </w:p>
         </w:tc>
@@ -3755,7 +3803,7 @@
                 <w:color w:val="17212B"/>
                 <w:sz w:val="19"/>
               </w:rPr>
-              <w:t>0.19</w:t>
+              <w:t>0.09</w:t>
             </w:r>
           </w:p>
         </w:tc>
@@ -3802,7 +3850,7 @@
                 <w:color w:val="17212B"/>
                 <w:sz w:val="19"/>
               </w:rPr>
-              <w:t>355</w:t>
+              <w:t>543</w:t>
             </w:r>
           </w:p>
         </w:tc>
@@ -3823,7 +3871,7 @@
                 <w:color w:val="17212B"/>
                 <w:sz w:val="19"/>
               </w:rPr>
-              <w:t>10</w:t>
+              <w:t>12</w:t>
             </w:r>
           </w:p>
         </w:tc>
@@ -3844,7 +3892,7 @@
                 <w:color w:val="17212B"/>
                 <w:sz w:val="19"/>
               </w:rPr>
-              <w:t>0.14</w:t>
+              <w:t>0.05</w:t>
             </w:r>
           </w:p>
         </w:tc>
@@ -3910,7 +3958,7 @@
                 <w:color w:val="17212B"/>
                 <w:sz w:val="19"/>
               </w:rPr>
-              <w:t>131</w:t>
+              <w:t>85</w:t>
             </w:r>
           </w:p>
         </w:tc>
@@ -3930,7 +3978,7 @@
                 <w:color w:val="17212B"/>
                 <w:sz w:val="19"/>
               </w:rPr>
-              <w:t>5</w:t>
+              <w:t>6</w:t>
             </w:r>
           </w:p>
         </w:tc>
@@ -3950,7 +3998,7 @@
                 <w:color w:val="17212B"/>
                 <w:sz w:val="19"/>
               </w:rPr>
-              <w:t>0.09</w:t>
+              <w:t>0.13</w:t>
             </w:r>
           </w:p>
         </w:tc>
@@ -3970,7 +4018,7 @@
                 <w:color w:val="17212B"/>
                 <w:sz w:val="19"/>
               </w:rPr>
-              <w:t>0.92</w:t>
+              <w:t>0.91</w:t>
             </w:r>
           </w:p>
         </w:tc>
@@ -4018,7 +4066,7 @@
           <w:color w:val="17212B"/>
           <w:sz w:val="22"/>
         </w:rPr>
-        <w:t>CO₂</w:t>
+        <w:t>疲勞程度</w:t>
       </w:r>
       <w:r>
         <w:rPr>
@@ -4027,7 +4075,7 @@
           <w:color w:val="17212B"/>
           <w:sz w:val="22"/>
         </w:rPr>
-        <w:t>：在同時控制溫度、濕度與四個控制變因後，CO₂ 對六個依變量都沒有達到顯著。</w:t>
+        <w:t>：三個環境變項都不顯著；只有睡眠時長顯著（每多睡 1 小時，疲勞 −0.61 分）。</w:t>
       </w:r>
     </w:p>
     <w:p>
@@ -4051,7 +4099,7 @@
           <w:color w:val="17212B"/>
           <w:sz w:val="22"/>
         </w:rPr>
-        <w:t>溫度</w:t>
+        <w:t>反應時間</w:t>
       </w:r>
       <w:r>
         <w:rPr>
@@ -4060,7 +4108,7 @@
           <w:color w:val="17212B"/>
           <w:sz w:val="22"/>
         </w:rPr>
-        <w:t>：溫度較高時，干擾分數較小（每 +1 °C −67 ms）、瞬時心率較低（−4.0 bpm）、心率變異度較高（約 +20%）。</w:t>
+        <w:t>：CO₂ 每 +100 ppm 慢 4.5 ms、溫度每 +1 °C 慢 54 ms，兩者都顯著。</w:t>
       </w:r>
     </w:p>
     <w:p>
@@ -4084,7 +4132,7 @@
           <w:color w:val="17212B"/>
           <w:sz w:val="22"/>
         </w:rPr>
-        <w:t>濕度</w:t>
+        <w:t>正確率、干擾分數</w:t>
       </w:r>
       <w:r>
         <w:rPr>
@@ -4093,7 +4141,7 @@
           <w:color w:val="17212B"/>
           <w:sz w:val="22"/>
         </w:rPr>
-        <w:t>：濕度較高時，瞬時心率較高（每 +1 % +0.6 bpm）；對其他依變量沒有顯著影響。</w:t>
+        <w:t>：沒有任何變項顯著。</w:t>
       </w:r>
     </w:p>
     <w:p>
@@ -4117,7 +4165,7 @@
           <w:color w:val="17212B"/>
           <w:sz w:val="22"/>
         </w:rPr>
-        <w:t>疲勞程度</w:t>
+        <w:t>瞬時心率</w:t>
       </w:r>
       <w:r>
         <w:rPr>
@@ -4126,7 +4174,7 @@
           <w:color w:val="17212B"/>
           <w:sz w:val="22"/>
         </w:rPr>
-        <w:t>：只有睡眠時長顯著（每多睡 1 小時，疲勞 −0.61 分）；環境三個變項都不顯著。</w:t>
+        <w:t>：溫度每 +1 °C 心率 −3.3 bpm、濕度每 +1 % +0.6 bpm、開冷氣時 −2.9 bpm，都顯著；CO₂ 不顯著。</w:t>
       </w:r>
     </w:p>
     <w:p>
@@ -4150,7 +4198,7 @@
           <w:color w:val="17212B"/>
           <w:sz w:val="22"/>
         </w:rPr>
-        <w:t>控制變因</w:t>
+        <w:t>心率變異度</w:t>
       </w:r>
       <w:r>
         <w:rPr>
@@ -4159,40 +4207,7 @@
           <w:color w:val="17212B"/>
           <w:sz w:val="22"/>
         </w:rPr>
-        <w:t>：開冷氣時瞬時心率較低（−4.0 bpm）。</w:t>
-      </w:r>
-    </w:p>
-    <w:p>
-      <w:pPr>
-        <w:spacing w:before="0" w:after="40" w:line="340" w:lineRule="exact"/>
-        <w:ind w:left="340" w:hanging="227"/>
-      </w:pPr>
-      <w:r>
-        <w:rPr>
-          <w:rFonts w:ascii="Times New Roman" w:hAnsi="Times New Roman" w:cs="Times New Roman" w:eastAsia="標楷體"/>
-          <w:b w:val="0"/>
-          <w:color w:val="17212B"/>
-          <w:sz w:val="22"/>
-        </w:rPr>
-        <w:t>・</w:t>
-      </w:r>
-      <w:r>
-        <w:rPr>
-          <w:rFonts w:ascii="Times New Roman" w:hAnsi="Times New Roman" w:cs="Times New Roman" w:eastAsia="標楷體"/>
-          <w:b/>
-          <w:color w:val="17212B"/>
-          <w:sz w:val="22"/>
-        </w:rPr>
-        <w:t>反應時間與正確率</w:t>
-      </w:r>
-      <w:r>
-        <w:rPr>
-          <w:rFonts w:ascii="Times New Roman" w:hAnsi="Times New Roman" w:cs="Times New Roman" w:eastAsia="標楷體"/>
-          <w:b w:val="0"/>
-          <w:color w:val="17212B"/>
-          <w:sz w:val="22"/>
-        </w:rPr>
-        <w:t>：沒有任何變項達到顯著；學生之間的差異很大（反應時間的條件 R² 0.62，邊際 R² 只有 0.04）。</w:t>
+        <w:t>：CO₂ 每 +100 ppm RMSSD 約 −12%、濕度每 +1 % 約 −10%、溫度每 +1 °C 約 +29%，都顯著。但只有 6 位學生，且在敏感度分析中 CO₂ 與濕度的效果消失（見第六節），不宜下結論。</w:t>
       </w:r>
     </w:p>
     <w:p>
@@ -4241,7 +4256,7 @@
           <w:color w:val="17212B"/>
           <w:sz w:val="22"/>
         </w:rPr>
-        <w:t>：開冷氣時會關窗，CO₂ 上升、溫度與濕度同時下降。三者同時放入模型後，共同變動的部分很難分給哪一個變項，所以每個係數的信賴區間都比較寬。變異數膨脹因子（VIF）CO₂ 最高 4.3、所有變項最高 5.4，在可接受範圍（&lt; 10），但仍會削弱檢定力。</w:t>
+        <w:t>：開冷氣時會關窗，CO₂ 上升、溫度與濕度同時下降。三者同時放入模型後，共同變動的部分很難分給哪一個變項，所以信賴區間比較寬，係數也容易隨樣本改變。變異數膨脹因子（VIF）CO₂ 最高 4.1、所有變項最高 4.8，在可接受範圍（&lt; 10）。</w:t>
       </w:r>
     </w:p>
     <w:p>
@@ -4312,39 +4327,6 @@
     </w:p>
     <w:p>
       <w:pPr>
-        <w:spacing w:before="0" w:after="40" w:line="340" w:lineRule="exact"/>
-        <w:ind w:left="340" w:hanging="227"/>
-      </w:pPr>
-      <w:r>
-        <w:rPr>
-          <w:rFonts w:ascii="Times New Roman" w:hAnsi="Times New Roman" w:cs="Times New Roman" w:eastAsia="標楷體"/>
-          <w:b w:val="0"/>
-          <w:color w:val="17212B"/>
-          <w:sz w:val="22"/>
-        </w:rPr>
-        <w:t>・</w:t>
-      </w:r>
-      <w:r>
-        <w:rPr>
-          <w:rFonts w:ascii="Times New Roman" w:hAnsi="Times New Roman" w:cs="Times New Roman" w:eastAsia="標楷體"/>
-          <w:b/>
-          <w:color w:val="17212B"/>
-          <w:sz w:val="22"/>
-        </w:rPr>
-        <w:t>心率變異度只有 5 位學生</w:t>
-      </w:r>
-      <w:r>
-        <w:rPr>
-          <w:rFonts w:ascii="Times New Roman" w:hAnsi="Times New Roman" w:cs="Times New Roman" w:eastAsia="標楷體"/>
-          <w:b w:val="0"/>
-          <w:color w:val="17212B"/>
-          <w:sz w:val="22"/>
-        </w:rPr>
-        <w:t>，結果較不穩定。</w:t>
-      </w:r>
-    </w:p>
-    <w:p>
-      <w:pPr>
         <w:keepNext/>
         <w:spacing w:before="0" w:after="80" w:line="340" w:lineRule="exact"/>
       </w:pPr>
@@ -4355,7 +4337,7 @@
           <w:color w:val="17212B"/>
           <w:sz w:val="22"/>
         </w:rPr>
-        <w:t>敏感度分析：睡眠資料來自疲勞量表，沒填量表的 Stroop 與心率資料會被排除。拿掉兩個睡眠控制變因、納入所有有資料的筆數後，三個自變量的結果如下（p &lt; .05 以粗體標示）：</w:t>
+        <w:t>敏感度分析：把睡眠時長與睡眠品質也放進其他五個模型（沒填量表的人次會被排除），三個自變量的結果如下（p &lt; .05 以粗體標示）：</w:t>
       </w:r>
     </w:p>
     <w:tbl>
@@ -4508,116 +4490,6 @@
                 <w:color w:val="17212B"/>
                 <w:sz w:val="19"/>
               </w:rPr>
-              <w:t>疲勞程度</w:t>
-            </w:r>
-          </w:p>
-        </w:tc>
-        <w:tc>
-          <w:tcPr>
-            <w:tcW w:type="dxa" w:w="1361"/>
-          </w:tcPr>
-          <w:p>
-            <w:pPr>
-              <w:keepNext/>
-              <w:spacing w:before="0" w:after="0" w:line="260" w:lineRule="exact"/>
-              <w:jc w:val="center"/>
-            </w:pPr>
-            <w:r>
-              <w:rPr>
-                <w:rFonts w:ascii="Times New Roman" w:hAnsi="Times New Roman" w:cs="Times New Roman" w:eastAsia="標楷體"/>
-                <w:b w:val="0"/>
-                <w:color w:val="17212B"/>
-                <w:sz w:val="19"/>
-              </w:rPr>
-              <w:t>99／11</w:t>
-            </w:r>
-          </w:p>
-        </w:tc>
-        <w:tc>
-          <w:tcPr>
-            <w:tcW w:type="dxa" w:w="2098"/>
-          </w:tcPr>
-          <w:p>
-            <w:pPr>
-              <w:keepNext/>
-              <w:spacing w:before="0" w:after="0" w:line="260" w:lineRule="exact"/>
-              <w:jc w:val="center"/>
-            </w:pPr>
-            <w:r>
-              <w:rPr>
-                <w:rFonts w:ascii="Times New Roman" w:hAnsi="Times New Roman" w:cs="Times New Roman" w:eastAsia="標楷體"/>
-                <w:b w:val="0"/>
-                <w:color w:val="17212B"/>
-                <w:sz w:val="19"/>
-              </w:rPr>
-              <w:t>+0.02（p = .627）</w:t>
-            </w:r>
-          </w:p>
-        </w:tc>
-        <w:tc>
-          <w:tcPr>
-            <w:tcW w:type="dxa" w:w="2098"/>
-          </w:tcPr>
-          <w:p>
-            <w:pPr>
-              <w:keepNext/>
-              <w:spacing w:before="0" w:after="0" w:line="260" w:lineRule="exact"/>
-              <w:jc w:val="center"/>
-            </w:pPr>
-            <w:r>
-              <w:rPr>
-                <w:rFonts w:ascii="Times New Roman" w:hAnsi="Times New Roman" w:cs="Times New Roman" w:eastAsia="標楷體"/>
-                <w:b w:val="0"/>
-                <w:color w:val="17212B"/>
-                <w:sz w:val="19"/>
-              </w:rPr>
-              <w:t>-0.23（p = .637）</w:t>
-            </w:r>
-          </w:p>
-        </w:tc>
-        <w:tc>
-          <w:tcPr>
-            <w:tcW w:type="dxa" w:w="2041"/>
-          </w:tcPr>
-          <w:p>
-            <w:pPr>
-              <w:keepNext/>
-              <w:spacing w:before="0" w:after="0" w:line="260" w:lineRule="exact"/>
-              <w:jc w:val="center"/>
-            </w:pPr>
-            <w:r>
-              <w:rPr>
-                <w:rFonts w:ascii="Times New Roman" w:hAnsi="Times New Roman" w:cs="Times New Roman" w:eastAsia="標楷體"/>
-                <w:b w:val="0"/>
-                <w:color w:val="17212B"/>
-                <w:sz w:val="19"/>
-              </w:rPr>
-              <w:t>+0.00（p = .966）</w:t>
-            </w:r>
-          </w:p>
-        </w:tc>
-      </w:tr>
-      <w:tr>
-        <w:trPr>
-          <w:cantSplit/>
-        </w:trPr>
-        <w:tc>
-          <w:tcPr>
-            <w:tcW w:type="dxa" w:w="2041"/>
-          </w:tcPr>
-          <w:p>
-            <w:pPr>
-              <w:keepNext/>
-              <w:spacing w:before="0" w:after="0" w:line="260" w:lineRule="exact"/>
-              <w:jc w:val="left"/>
-            </w:pPr>
-            <w:r>
-              <w:rPr>
-                <w:rFonts w:ascii="Times New Roman" w:hAnsi="Times New Roman" w:cs="Times New Roman" w:eastAsia="標楷體"/>
-                <w:b w:val="0"/>
-                <w:color w:val="17212B"/>
-                <w:sz w:val="19"/>
-              </w:rPr>
               <w:t>反應時間</w:t>
             </w:r>
           </w:p>
@@ -4639,7 +4511,7 @@
                 <w:color w:val="17212B"/>
                 <w:sz w:val="19"/>
               </w:rPr>
-              <w:t>116／12</w:t>
+              <w:t>94／11</w:t>
             </w:r>
           </w:p>
         </w:tc>
@@ -4656,11 +4528,11 @@
             <w:r>
               <w:rPr>
                 <w:rFonts w:ascii="Times New Roman" w:hAnsi="Times New Roman" w:cs="Times New Roman" w:eastAsia="標楷體"/>
-                <w:b/>
+                <w:b w:val="0"/>
                 <w:color w:val="17212B"/>
                 <w:sz w:val="19"/>
               </w:rPr>
-              <w:t>+4.5（p = .035）</w:t>
+              <w:t>+3.7（p = .103）</w:t>
             </w:r>
           </w:p>
         </w:tc>
@@ -4677,11 +4549,11 @@
             <w:r>
               <w:rPr>
                 <w:rFonts w:ascii="Times New Roman" w:hAnsi="Times New Roman" w:cs="Times New Roman" w:eastAsia="標楷體"/>
-                <w:b/>
+                <w:b w:val="0"/>
                 <w:color w:val="17212B"/>
                 <w:sz w:val="19"/>
               </w:rPr>
-              <w:t>+53.9（p = .026）</w:t>
+              <w:t>+38.7（p = .124）</w:t>
             </w:r>
           </w:p>
         </w:tc>
@@ -4702,7 +4574,7 @@
                 <w:color w:val="17212B"/>
                 <w:sz w:val="19"/>
               </w:rPr>
-              <w:t>-0.2（p = .941）</w:t>
+              <w:t>+0.5（p = .831）</w:t>
             </w:r>
           </w:p>
         </w:tc>
@@ -4749,7 +4621,7 @@
                 <w:color w:val="17212B"/>
                 <w:sz w:val="19"/>
               </w:rPr>
-              <w:t>116／12</w:t>
+              <w:t>94／11</w:t>
             </w:r>
           </w:p>
         </w:tc>
@@ -4770,7 +4642,7 @@
                 <w:color w:val="17212B"/>
                 <w:sz w:val="19"/>
               </w:rPr>
-              <w:t>+0.003（p = .151）</w:t>
+              <w:t>+0.002（p = .417）</w:t>
             </w:r>
           </w:p>
         </w:tc>
@@ -4791,7 +4663,7 @@
                 <w:color w:val="17212B"/>
                 <w:sz w:val="19"/>
               </w:rPr>
-              <w:t>+0.038（p = .130）</w:t>
+              <w:t>+0.045（p = .122）</w:t>
             </w:r>
           </w:p>
         </w:tc>
@@ -4812,7 +4684,7 @@
                 <w:color w:val="17212B"/>
                 <w:sz w:val="19"/>
               </w:rPr>
-              <w:t>+0.002（p = .432）</w:t>
+              <w:t>+0.002（p = .394）</w:t>
             </w:r>
           </w:p>
         </w:tc>
@@ -4859,7 +4731,7 @@
                 <w:color w:val="17212B"/>
                 <w:sz w:val="19"/>
               </w:rPr>
-              <w:t>116／12</w:t>
+              <w:t>94／11</w:t>
             </w:r>
           </w:p>
         </w:tc>
@@ -4880,7 +4752,7 @@
                 <w:color w:val="17212B"/>
                 <w:sz w:val="19"/>
               </w:rPr>
-              <w:t>+0.4（p = .897）</w:t>
+              <w:t>-1.5（p = .575）</w:t>
             </w:r>
           </w:p>
         </w:tc>
@@ -4897,11 +4769,11 @@
             <w:r>
               <w:rPr>
                 <w:rFonts w:ascii="Times New Roman" w:hAnsi="Times New Roman" w:cs="Times New Roman" w:eastAsia="標楷體"/>
-                <w:b w:val="0"/>
+                <w:b/>
                 <w:color w:val="17212B"/>
                 <w:sz w:val="19"/>
               </w:rPr>
-              <w:t>-18.2（p = .599）</w:t>
+              <w:t>-66.8（p = .027）</w:t>
             </w:r>
           </w:p>
         </w:tc>
@@ -4922,7 +4794,7 @@
                 <w:color w:val="17212B"/>
                 <w:sz w:val="19"/>
               </w:rPr>
-              <w:t>-0.6（p = .857）</w:t>
+              <w:t>-2.2（p = .472）</w:t>
             </w:r>
           </w:p>
         </w:tc>
@@ -4969,7 +4841,7 @@
                 <w:color w:val="17212B"/>
                 <w:sz w:val="19"/>
               </w:rPr>
-              <w:t>543／12</w:t>
+              <w:t>355／10</w:t>
             </w:r>
           </w:p>
         </w:tc>
@@ -4990,7 +4862,7 @@
                 <w:color w:val="17212B"/>
                 <w:sz w:val="19"/>
               </w:rPr>
-              <w:t>-0.1（p = .308）</w:t>
+              <w:t>-0.2（p = .169）</w:t>
             </w:r>
           </w:p>
         </w:tc>
@@ -5011,7 +4883,7 @@
                 <w:color w:val="17212B"/>
                 <w:sz w:val="19"/>
               </w:rPr>
-              <w:t>-3.3（p = &lt; .001）</w:t>
+              <w:t>-4.0（p = &lt; .001）</w:t>
             </w:r>
           </w:p>
         </w:tc>
@@ -5077,7 +4949,27 @@
                 <w:color w:val="17212B"/>
                 <w:sz w:val="19"/>
               </w:rPr>
-              <w:t>197／6</w:t>
+              <w:t>51／5</w:t>
+            </w:r>
+          </w:p>
+        </w:tc>
+        <w:tc>
+          <w:tcPr>
+            <w:tcW w:type="dxa" w:w="2098"/>
+          </w:tcPr>
+          <w:p>
+            <w:pPr>
+              <w:spacing w:before="0" w:after="0" w:line="260" w:lineRule="exact"/>
+              <w:jc w:val="center"/>
+            </w:pPr>
+            <w:r>
+              <w:rPr>
+                <w:rFonts w:ascii="Times New Roman" w:hAnsi="Times New Roman" w:cs="Times New Roman" w:eastAsia="標楷體"/>
+                <w:b w:val="0"/>
+                <w:color w:val="17212B"/>
+                <w:sz w:val="19"/>
+              </w:rPr>
+              <w:t>-0.010（p = .805）</w:t>
             </w:r>
           </w:p>
         </w:tc>
@@ -5097,27 +4989,7 @@
                 <w:color w:val="17212B"/>
                 <w:sz w:val="19"/>
               </w:rPr>
-              <w:t>-0.037（p = .030）</w:t>
-            </w:r>
-          </w:p>
-        </w:tc>
-        <w:tc>
-          <w:tcPr>
-            <w:tcW w:type="dxa" w:w="2098"/>
-          </w:tcPr>
-          <w:p>
-            <w:pPr>
-              <w:spacing w:before="0" w:after="0" w:line="260" w:lineRule="exact"/>
-              <w:jc w:val="center"/>
-            </w:pPr>
-            <w:r>
-              <w:rPr>
-                <w:rFonts w:ascii="Times New Roman" w:hAnsi="Times New Roman" w:cs="Times New Roman" w:eastAsia="標楷體"/>
-                <w:b/>
-                <w:color w:val="17212B"/>
-                <w:sz w:val="19"/>
-              </w:rPr>
-              <w:t>+0.175（p = .040）</w:t>
+              <w:t>+0.316（p = .023）</w:t>
             </w:r>
           </w:p>
         </w:tc>
@@ -5133,11 +5005,11 @@
             <w:r>
               <w:rPr>
                 <w:rFonts w:ascii="Times New Roman" w:hAnsi="Times New Roman" w:cs="Times New Roman" w:eastAsia="標楷體"/>
-                <w:b/>
+                <w:b w:val="0"/>
                 <w:color w:val="17212B"/>
                 <w:sz w:val="19"/>
               </w:rPr>
-              <w:t>-0.033（p = .049）</w:t>
+              <w:t>-0.007（p = .867）</w:t>
             </w:r>
           </w:p>
         </w:tc>
@@ -5160,7 +5032,25 @@
           <w:color w:val="17212B"/>
           <w:sz w:val="21"/>
         </w:rPr>
-        <w:t>・納入更多資料後，反應時間的 CO₂（每 +100 ppm +4.5 ms）與溫度（每 +1 °C +54 ms）、心率變異度的 CO₂（約 −3.6%）變成顯著；瞬時心率與疲勞程度的結論不變。</w:t>
+        <w:t>・</w:t>
+      </w:r>
+      <w:r>
+        <w:rPr>
+          <w:rFonts w:ascii="Times New Roman" w:hAnsi="Times New Roman" w:cs="Times New Roman" w:eastAsia="標楷體"/>
+          <w:b/>
+          <w:color w:val="17212B"/>
+          <w:sz w:val="21"/>
+        </w:rPr>
+        <w:t>兩種做法都成立</w:t>
+      </w:r>
+      <w:r>
+        <w:rPr>
+          <w:rFonts w:ascii="Times New Roman" w:hAnsi="Times New Roman" w:cs="Times New Roman" w:eastAsia="標楷體"/>
+          <w:b w:val="0"/>
+          <w:color w:val="17212B"/>
+          <w:sz w:val="21"/>
+        </w:rPr>
+        <w:t>：瞬時心率的溫度（−）與濕度（＋）、心率變異度的溫度（＋）、疲勞程度的睡眠時長。</w:t>
       </w:r>
     </w:p>
     <w:p>
@@ -5175,7 +5065,40 @@
           <w:color w:val="17212B"/>
           <w:sz w:val="21"/>
         </w:rPr>
-        <w:t>・結果會隨納入的樣本改變，代表目前的資料量還不足以穩定地區分 CO₂、溫度與濕度各自的影響。</w:t>
+        <w:t>・</w:t>
+      </w:r>
+      <w:r>
+        <w:rPr>
+          <w:rFonts w:ascii="Times New Roman" w:hAnsi="Times New Roman" w:cs="Times New Roman" w:eastAsia="標楷體"/>
+          <w:b/>
+          <w:color w:val="17212B"/>
+          <w:sz w:val="21"/>
+        </w:rPr>
+        <w:t>只在其中一種做法成立</w:t>
+      </w:r>
+      <w:r>
+        <w:rPr>
+          <w:rFonts w:ascii="Times New Roman" w:hAnsi="Times New Roman" w:cs="Times New Roman" w:eastAsia="標楷體"/>
+          <w:b w:val="0"/>
+          <w:color w:val="17212B"/>
+          <w:sz w:val="21"/>
+        </w:rPr>
+        <w:t>：反應時間的 CO₂ 與溫度、心率變異度的 CO₂ 與濕度（只在主要分析顯著）；干擾分數的溫度（只在敏感度分析顯著）。</w:t>
+      </w:r>
+    </w:p>
+    <w:p>
+      <w:pPr>
+        <w:spacing w:before="0" w:after="40" w:line="340" w:lineRule="exact"/>
+        <w:ind w:left="340" w:hanging="227"/>
+      </w:pPr>
+      <w:r>
+        <w:rPr>
+          <w:rFonts w:ascii="Times New Roman" w:hAnsi="Times New Roman" w:cs="Times New Roman" w:eastAsia="標楷體"/>
+          <w:b w:val="0"/>
+          <w:color w:val="17212B"/>
+          <w:sz w:val="21"/>
+        </w:rPr>
+        <w:t>・多 1～2 位學生就會改變這些結果，代表目前的資料量還不足以穩定地區分 CO₂、溫度與濕度各自的影響。</w:t>
       </w:r>
     </w:p>
     <w:sectPr>

</xml_diff>

<commit_message>
Add pairwise within-student Spearman correlations (IVs x DVs, DVs x DVs) with permutation p and FDR; report section 7
Co-Authored-By: Claude Opus 5.5 <noreply@anthropic.com>
</commit_message>
<xml_diff>
--- a/results/LMM/LMM 分析結果.docx
+++ b/results/LMM/LMM 分析結果.docx
@@ -5101,6 +5101,892 @@
         <w:t>・多 1～2 位學生就會改變這些結果，代表目前的資料量還不足以穩定地區分 CO₂、溫度與濕度各自的影響。</w:t>
       </w:r>
     </w:p>
+    <w:p>
+      <w:pPr>
+        <w:keepNext/>
+        <w:pageBreakBefore/>
+        <w:spacing w:before="0" w:after="80" w:line="300" w:lineRule="auto"/>
+      </w:pPr>
+      <w:r>
+        <w:rPr>
+          <w:rFonts w:ascii="Times New Roman" w:hAnsi="Times New Roman" w:cs="Times New Roman" w:eastAsia="標楷體"/>
+          <w:b/>
+          <w:color w:val="0D7468"/>
+          <w:sz w:val="28"/>
+        </w:rPr>
+        <w:t>七、兩兩相關（Spearman 等級相關）</w:t>
+      </w:r>
+    </w:p>
+    <w:p>
+      <w:pPr>
+        <w:spacing w:before="0" w:after="80" w:line="340" w:lineRule="exact"/>
+      </w:pPr>
+      <w:r>
+        <w:rPr>
+          <w:rFonts w:ascii="Times New Roman" w:hAnsi="Times New Roman" w:cs="Times New Roman" w:eastAsia="標楷體"/>
+          <w:b w:val="0"/>
+          <w:color w:val="17212B"/>
+          <w:sz w:val="22"/>
+        </w:rPr>
+        <w:t>除了上面同時放入所有變項的 LMM，另外把三個自變量與六個依變量兩兩配對（控制變因不列入），逐一檢查有沒有相關。方法：</w:t>
+      </w:r>
+    </w:p>
+    <w:p>
+      <w:pPr>
+        <w:spacing w:before="0" w:after="40" w:line="340" w:lineRule="exact"/>
+        <w:ind w:left="340" w:hanging="227"/>
+      </w:pPr>
+      <w:r>
+        <w:rPr>
+          <w:rFonts w:ascii="Times New Roman" w:hAnsi="Times New Roman" w:cs="Times New Roman" w:eastAsia="標楷體"/>
+          <w:b w:val="0"/>
+          <w:color w:val="17212B"/>
+          <w:sz w:val="21"/>
+        </w:rPr>
+        <w:t>・</w:t>
+      </w:r>
+      <w:r>
+        <w:rPr>
+          <w:rFonts w:ascii="Times New Roman" w:hAnsi="Times New Roman" w:cs="Times New Roman" w:eastAsia="標楷體"/>
+          <w:b/>
+          <w:color w:val="17212B"/>
+          <w:sz w:val="21"/>
+        </w:rPr>
+        <w:t>Spearman 等級相關</w:t>
+      </w:r>
+      <w:r>
+        <w:rPr>
+          <w:rFonts w:ascii="Times New Roman" w:hAnsi="Times New Roman" w:cs="Times New Roman" w:eastAsia="標楷體"/>
+          <w:b w:val="0"/>
+          <w:color w:val="17212B"/>
+          <w:sz w:val="21"/>
+        </w:rPr>
+        <w:t>：只看兩個變項的排序是否一起升降，不假設常態分配，屬於無母數方法。</w:t>
+      </w:r>
+    </w:p>
+    <w:p>
+      <w:pPr>
+        <w:spacing w:before="0" w:after="40" w:line="340" w:lineRule="exact"/>
+        <w:ind w:left="340" w:hanging="227"/>
+      </w:pPr>
+      <w:r>
+        <w:rPr>
+          <w:rFonts w:ascii="Times New Roman" w:hAnsi="Times New Roman" w:cs="Times New Roman" w:eastAsia="標楷體"/>
+          <w:b w:val="0"/>
+          <w:color w:val="17212B"/>
+          <w:sz w:val="21"/>
+        </w:rPr>
+        <w:t>・</w:t>
+      </w:r>
+      <w:r>
+        <w:rPr>
+          <w:rFonts w:ascii="Times New Roman" w:hAnsi="Times New Roman" w:cs="Times New Roman" w:eastAsia="標楷體"/>
+          <w:b/>
+          <w:color w:val="17212B"/>
+          <w:sz w:val="21"/>
+        </w:rPr>
+        <w:t>個人內</w:t>
+      </w:r>
+      <w:r>
+        <w:rPr>
+          <w:rFonts w:ascii="Times New Roman" w:hAnsi="Times New Roman" w:cs="Times New Roman" w:eastAsia="標楷體"/>
+          <w:b w:val="0"/>
+          <w:color w:val="17212B"/>
+          <w:sz w:val="21"/>
+        </w:rPr>
+        <w:t>：每位學生先減去自己的平均再計算，排除「人與人之間」的差異；只測到 1 次的學生不提供資訊，不納入。</w:t>
+      </w:r>
+    </w:p>
+    <w:p>
+      <w:pPr>
+        <w:spacing w:before="0" w:after="40" w:line="340" w:lineRule="exact"/>
+        <w:ind w:left="340" w:hanging="227"/>
+      </w:pPr>
+      <w:r>
+        <w:rPr>
+          <w:rFonts w:ascii="Times New Roman" w:hAnsi="Times New Roman" w:cs="Times New Roman" w:eastAsia="標楷體"/>
+          <w:b w:val="0"/>
+          <w:color w:val="17212B"/>
+          <w:sz w:val="21"/>
+        </w:rPr>
+        <w:t>・</w:t>
+      </w:r>
+      <w:r>
+        <w:rPr>
+          <w:rFonts w:ascii="Times New Roman" w:hAnsi="Times New Roman" w:cs="Times New Roman" w:eastAsia="標楷體"/>
+          <w:b/>
+          <w:color w:val="17212B"/>
+          <w:sz w:val="21"/>
+        </w:rPr>
+        <w:t>每位學生每節課一筆</w:t>
+      </w:r>
+      <w:r>
+        <w:rPr>
+          <w:rFonts w:ascii="Times New Roman" w:hAnsi="Times New Roman" w:cs="Times New Roman" w:eastAsia="標楷體"/>
+          <w:b w:val="0"/>
+          <w:color w:val="17212B"/>
+          <w:sz w:val="21"/>
+        </w:rPr>
+        <w:t>：心率、心率變異度先取該生該節所有 5 分鐘時段的平均。</w:t>
+      </w:r>
+    </w:p>
+    <w:p>
+      <w:pPr>
+        <w:spacing w:before="0" w:after="40" w:line="340" w:lineRule="exact"/>
+        <w:ind w:left="340" w:hanging="227"/>
+      </w:pPr>
+      <w:r>
+        <w:rPr>
+          <w:rFonts w:ascii="Times New Roman" w:hAnsi="Times New Roman" w:cs="Times New Roman" w:eastAsia="標楷體"/>
+          <w:b w:val="0"/>
+          <w:color w:val="17212B"/>
+          <w:sz w:val="21"/>
+        </w:rPr>
+        <w:t>・</w:t>
+      </w:r>
+      <w:r>
+        <w:rPr>
+          <w:rFonts w:ascii="Times New Roman" w:hAnsi="Times New Roman" w:cs="Times New Roman" w:eastAsia="標楷體"/>
+          <w:b/>
+          <w:color w:val="17212B"/>
+          <w:sz w:val="21"/>
+        </w:rPr>
+        <w:t>樣本數要求</w:t>
+      </w:r>
+      <w:r>
+        <w:rPr>
+          <w:rFonts w:ascii="Times New Roman" w:hAnsi="Times New Roman" w:cs="Times New Roman" w:eastAsia="標楷體"/>
+          <w:b w:val="0"/>
+          <w:color w:val="17212B"/>
+          <w:sz w:val="21"/>
+        </w:rPr>
+        <w:t>：至少 20 筆配對、5 位學生，否則不做檢定。</w:t>
+      </w:r>
+    </w:p>
+    <w:p>
+      <w:pPr>
+        <w:spacing w:before="0" w:after="40" w:line="340" w:lineRule="exact"/>
+        <w:ind w:left="340" w:hanging="227"/>
+      </w:pPr>
+      <w:r>
+        <w:rPr>
+          <w:rFonts w:ascii="Times New Roman" w:hAnsi="Times New Roman" w:cs="Times New Roman" w:eastAsia="標楷體"/>
+          <w:b w:val="0"/>
+          <w:color w:val="17212B"/>
+          <w:sz w:val="21"/>
+        </w:rPr>
+        <w:t>・</w:t>
+      </w:r>
+      <w:r>
+        <w:rPr>
+          <w:rFonts w:ascii="Times New Roman" w:hAnsi="Times New Roman" w:cs="Times New Roman" w:eastAsia="標楷體"/>
+          <w:b/>
+          <w:color w:val="17212B"/>
+          <w:sz w:val="21"/>
+        </w:rPr>
+        <w:t>p 值</w:t>
+      </w:r>
+      <w:r>
+        <w:rPr>
+          <w:rFonts w:ascii="Times New Roman" w:hAnsi="Times New Roman" w:cs="Times New Roman" w:eastAsia="標楷體"/>
+          <w:b w:val="0"/>
+          <w:color w:val="17212B"/>
+          <w:sz w:val="21"/>
+        </w:rPr>
+        <w:t>：學生內置換檢定（在每位學生內部打亂其中一個變項 10,000 次），考慮了同一位學生重複測量。</w:t>
+      </w:r>
+    </w:p>
+    <w:p>
+      <w:pPr>
+        <w:spacing w:before="0" w:after="40" w:line="340" w:lineRule="exact"/>
+        <w:ind w:left="340" w:hanging="227"/>
+      </w:pPr>
+      <w:r>
+        <w:rPr>
+          <w:rFonts w:ascii="Times New Roman" w:hAnsi="Times New Roman" w:cs="Times New Roman" w:eastAsia="標楷體"/>
+          <w:b w:val="0"/>
+          <w:color w:val="17212B"/>
+          <w:sz w:val="21"/>
+        </w:rPr>
+        <w:t>・</w:t>
+      </w:r>
+      <w:r>
+        <w:rPr>
+          <w:rFonts w:ascii="Times New Roman" w:hAnsi="Times New Roman" w:cs="Times New Roman" w:eastAsia="標楷體"/>
+          <w:b/>
+          <w:color w:val="17212B"/>
+          <w:sz w:val="21"/>
+        </w:rPr>
+        <w:t>多重比較校正</w:t>
+      </w:r>
+      <w:r>
+        <w:rPr>
+          <w:rFonts w:ascii="Times New Roman" w:hAnsi="Times New Roman" w:cs="Times New Roman" w:eastAsia="標楷體"/>
+          <w:b w:val="0"/>
+          <w:color w:val="17212B"/>
+          <w:sz w:val="21"/>
+        </w:rPr>
+        <w:t>：共檢定 25 組，以 FDR（Benjamini–Hochberg）校正，控制「顯著結果中假陽性的比例」不超過 5%。</w:t>
+      </w:r>
+    </w:p>
+    <w:p>
+      <w:pPr>
+        <w:keepNext/>
+        <w:spacing w:before="80" w:after="40" w:line="240" w:lineRule="auto"/>
+        <w:jc w:val="center"/>
+      </w:pPr>
+      <w:r>
+        <w:drawing>
+          <wp:inline xmlns:a="http://schemas.openxmlformats.org/drawingml/2006/main" xmlns:pic="http://schemas.openxmlformats.org/drawingml/2006/picture">
+            <wp:extent cx="5760000" cy="4488000"/>
+            <wp:docPr id="3" name="Picture 3"/>
+            <wp:cNvGraphicFramePr>
+              <a:graphicFrameLocks noChangeAspect="1"/>
+            </wp:cNvGraphicFramePr>
+            <a:graphic>
+              <a:graphicData uri="http://schemas.openxmlformats.org/drawingml/2006/picture">
+                <pic:pic>
+                  <pic:nvPicPr>
+                    <pic:cNvPr id="0" name="03_兩兩相關.png"/>
+                    <pic:cNvPicPr/>
+                  </pic:nvPicPr>
+                  <pic:blipFill>
+                    <a:blip r:embed="rId11"/>
+                    <a:stretch>
+                      <a:fillRect/>
+                    </a:stretch>
+                  </pic:blipFill>
+                  <pic:spPr>
+                    <a:xfrm>
+                      <a:off x="0" y="0"/>
+                      <a:ext cx="5760000" cy="4488000"/>
+                    </a:xfrm>
+                    <a:prstGeom prst="rect"/>
+                  </pic:spPr>
+                </pic:pic>
+              </a:graphicData>
+            </a:graphic>
+          </wp:inline>
+        </w:drawing>
+      </w:r>
+    </w:p>
+    <w:p>
+      <w:pPr>
+        <w:spacing w:before="0" w:after="160" w:line="340" w:lineRule="exact"/>
+      </w:pPr>
+      <w:r>
+        <w:rPr>
+          <w:rFonts w:ascii="Times New Roman" w:hAnsi="Times New Roman" w:cs="Times New Roman" w:eastAsia="標楷體"/>
+          <w:b w:val="0"/>
+          <w:color w:val="5B6670"/>
+          <w:sz w:val="19"/>
+        </w:rPr>
+        <w:t>圖 3　個人內 Spearman ρ。紅色為正相關、藍色為負相關，顏色越深相關越強；格內小字為配對筆數與未校正的 p 值。粗線以上為自變量 × 依變量，以下為依變量之間。</w:t>
+      </w:r>
+    </w:p>
+    <w:p>
+      <w:pPr>
+        <w:keepNext/>
+        <w:spacing w:before="0" w:after="80" w:line="340" w:lineRule="exact"/>
+      </w:pPr>
+      <w:r>
+        <w:rPr>
+          <w:rFonts w:ascii="Times New Roman" w:hAnsi="Times New Roman" w:cs="Times New Roman" w:eastAsia="標楷體"/>
+          <w:b/>
+          <w:color w:val="17212B"/>
+          <w:sz w:val="22"/>
+        </w:rPr>
+        <w:t>結果</w:t>
+      </w:r>
+      <w:r>
+        <w:rPr>
+          <w:rFonts w:ascii="Times New Roman" w:hAnsi="Times New Roman" w:cs="Times New Roman" w:eastAsia="標楷體"/>
+          <w:b w:val="0"/>
+          <w:color w:val="17212B"/>
+          <w:sz w:val="22"/>
+        </w:rPr>
+        <w:t>：FDR 校正後沒有任何一組達到顯著。未校正 p &lt; .05 的有 3 組：</w:t>
+      </w:r>
+    </w:p>
+    <w:tbl>
+      <w:tblPr>
+        <w:tblStyle w:val="TableGrid"/>
+        <w:tblW w:type="auto" w:w="0"/>
+        <w:jc w:val="center"/>
+        <w:tblLook w:firstColumn="1" w:firstRow="1" w:lastColumn="0" w:lastRow="0" w:noHBand="0" w:noVBand="1" w:val="04A0"/>
+      </w:tblPr>
+      <w:tblGrid>
+        <w:gridCol w:w="1928"/>
+        <w:gridCol w:w="1928"/>
+        <w:gridCol w:w="1928"/>
+        <w:gridCol w:w="1928"/>
+        <w:gridCol w:w="1928"/>
+      </w:tblGrid>
+      <w:tr>
+        <w:trPr>
+          <w:cantSplit/>
+        </w:trPr>
+        <w:tc>
+          <w:tcPr>
+            <w:tcW w:type="dxa" w:w="2835"/>
+            <w:shd w:val="clear" w:fill="E6F2F0"/>
+          </w:tcPr>
+          <w:p>
+            <w:pPr>
+              <w:keepNext/>
+              <w:spacing w:before="0" w:after="0" w:line="260" w:lineRule="exact"/>
+              <w:jc w:val="left"/>
+            </w:pPr>
+            <w:r>
+              <w:rPr>
+                <w:rFonts w:ascii="Times New Roman" w:hAnsi="Times New Roman" w:cs="Times New Roman" w:eastAsia="標楷體"/>
+                <w:b/>
+                <w:color w:val="17212B"/>
+                <w:sz w:val="19"/>
+              </w:rPr>
+              <w:t>配對</w:t>
+            </w:r>
+          </w:p>
+        </w:tc>
+        <w:tc>
+          <w:tcPr>
+            <w:tcW w:type="dxa" w:w="1134"/>
+            <w:shd w:val="clear" w:fill="E6F2F0"/>
+          </w:tcPr>
+          <w:p>
+            <w:pPr>
+              <w:keepNext/>
+              <w:spacing w:before="0" w:after="0" w:line="260" w:lineRule="exact"/>
+              <w:jc w:val="center"/>
+            </w:pPr>
+            <w:r>
+              <w:rPr>
+                <w:rFonts w:ascii="Times New Roman" w:hAnsi="Times New Roman" w:cs="Times New Roman" w:eastAsia="標楷體"/>
+                <w:b/>
+                <w:color w:val="17212B"/>
+                <w:sz w:val="19"/>
+              </w:rPr>
+              <w:t>ρ</w:t>
+            </w:r>
+          </w:p>
+        </w:tc>
+        <w:tc>
+          <w:tcPr>
+            <w:tcW w:type="dxa" w:w="1701"/>
+            <w:shd w:val="clear" w:fill="E6F2F0"/>
+          </w:tcPr>
+          <w:p>
+            <w:pPr>
+              <w:keepNext/>
+              <w:spacing w:before="0" w:after="0" w:line="260" w:lineRule="exact"/>
+              <w:jc w:val="center"/>
+            </w:pPr>
+            <w:r>
+              <w:rPr>
+                <w:rFonts w:ascii="Times New Roman" w:hAnsi="Times New Roman" w:cs="Times New Roman" w:eastAsia="標楷體"/>
+                <w:b/>
+                <w:color w:val="17212B"/>
+                <w:sz w:val="19"/>
+              </w:rPr>
+              <w:t>筆數／學生</w:t>
+            </w:r>
+          </w:p>
+        </w:tc>
+        <w:tc>
+          <w:tcPr>
+            <w:tcW w:type="dxa" w:w="1417"/>
+            <w:shd w:val="clear" w:fill="E6F2F0"/>
+          </w:tcPr>
+          <w:p>
+            <w:pPr>
+              <w:keepNext/>
+              <w:spacing w:before="0" w:after="0" w:line="260" w:lineRule="exact"/>
+              <w:jc w:val="center"/>
+            </w:pPr>
+            <w:r>
+              <w:rPr>
+                <w:rFonts w:ascii="Times New Roman" w:hAnsi="Times New Roman" w:cs="Times New Roman" w:eastAsia="標楷體"/>
+                <w:b/>
+                <w:color w:val="17212B"/>
+                <w:sz w:val="19"/>
+              </w:rPr>
+              <w:t>p</w:t>
+            </w:r>
+          </w:p>
+        </w:tc>
+        <w:tc>
+          <w:tcPr>
+            <w:tcW w:type="dxa" w:w="1701"/>
+            <w:shd w:val="clear" w:fill="E6F2F0"/>
+          </w:tcPr>
+          <w:p>
+            <w:pPr>
+              <w:keepNext/>
+              <w:spacing w:before="0" w:after="0" w:line="260" w:lineRule="exact"/>
+              <w:jc w:val="center"/>
+            </w:pPr>
+            <w:r>
+              <w:rPr>
+                <w:rFonts w:ascii="Times New Roman" w:hAnsi="Times New Roman" w:cs="Times New Roman" w:eastAsia="標楷體"/>
+                <w:b/>
+                <w:color w:val="17212B"/>
+                <w:sz w:val="19"/>
+              </w:rPr>
+              <w:t>FDR 校正 p</w:t>
+            </w:r>
+          </w:p>
+        </w:tc>
+      </w:tr>
+      <w:tr>
+        <w:trPr>
+          <w:cantSplit/>
+        </w:trPr>
+        <w:tc>
+          <w:tcPr>
+            <w:tcW w:type="dxa" w:w="2835"/>
+          </w:tcPr>
+          <w:p>
+            <w:pPr>
+              <w:keepNext/>
+              <w:spacing w:before="0" w:after="0" w:line="260" w:lineRule="exact"/>
+              <w:jc w:val="left"/>
+            </w:pPr>
+            <w:r>
+              <w:rPr>
+                <w:rFonts w:ascii="Times New Roman" w:hAnsi="Times New Roman" w:cs="Times New Roman" w:eastAsia="標楷體"/>
+                <w:b w:val="0"/>
+                <w:color w:val="17212B"/>
+                <w:sz w:val="19"/>
+              </w:rPr>
+              <w:t>CO₂ × 疲勞程度</w:t>
+            </w:r>
+          </w:p>
+        </w:tc>
+        <w:tc>
+          <w:tcPr>
+            <w:tcW w:type="dxa" w:w="1134"/>
+          </w:tcPr>
+          <w:p>
+            <w:pPr>
+              <w:keepNext/>
+              <w:spacing w:before="0" w:after="0" w:line="260" w:lineRule="exact"/>
+              <w:jc w:val="center"/>
+            </w:pPr>
+            <w:r>
+              <w:rPr>
+                <w:rFonts w:ascii="Times New Roman" w:hAnsi="Times New Roman" w:cs="Times New Roman" w:eastAsia="標楷體"/>
+                <w:b w:val="0"/>
+                <w:color w:val="17212B"/>
+                <w:sz w:val="19"/>
+              </w:rPr>
+              <w:t>+0.20</w:t>
+            </w:r>
+          </w:p>
+        </w:tc>
+        <w:tc>
+          <w:tcPr>
+            <w:tcW w:type="dxa" w:w="1701"/>
+          </w:tcPr>
+          <w:p>
+            <w:pPr>
+              <w:keepNext/>
+              <w:spacing w:before="0" w:after="0" w:line="260" w:lineRule="exact"/>
+              <w:jc w:val="center"/>
+            </w:pPr>
+            <w:r>
+              <w:rPr>
+                <w:rFonts w:ascii="Times New Roman" w:hAnsi="Times New Roman" w:cs="Times New Roman" w:eastAsia="標楷體"/>
+                <w:b w:val="0"/>
+                <w:color w:val="17212B"/>
+                <w:sz w:val="19"/>
+              </w:rPr>
+              <w:t>99／11</w:t>
+            </w:r>
+          </w:p>
+        </w:tc>
+        <w:tc>
+          <w:tcPr>
+            <w:tcW w:type="dxa" w:w="1417"/>
+          </w:tcPr>
+          <w:p>
+            <w:pPr>
+              <w:keepNext/>
+              <w:spacing w:before="0" w:after="0" w:line="260" w:lineRule="exact"/>
+              <w:jc w:val="center"/>
+            </w:pPr>
+            <w:r>
+              <w:rPr>
+                <w:rFonts w:ascii="Times New Roman" w:hAnsi="Times New Roman" w:cs="Times New Roman" w:eastAsia="標楷體"/>
+                <w:b w:val="0"/>
+                <w:color w:val="17212B"/>
+                <w:sz w:val="19"/>
+              </w:rPr>
+              <w:t>.049</w:t>
+            </w:r>
+          </w:p>
+        </w:tc>
+        <w:tc>
+          <w:tcPr>
+            <w:tcW w:type="dxa" w:w="1701"/>
+          </w:tcPr>
+          <w:p>
+            <w:pPr>
+              <w:keepNext/>
+              <w:spacing w:before="0" w:after="0" w:line="260" w:lineRule="exact"/>
+              <w:jc w:val="center"/>
+            </w:pPr>
+            <w:r>
+              <w:rPr>
+                <w:rFonts w:ascii="Times New Roman" w:hAnsi="Times New Roman" w:cs="Times New Roman" w:eastAsia="標楷體"/>
+                <w:b w:val="0"/>
+                <w:color w:val="17212B"/>
+                <w:sz w:val="19"/>
+              </w:rPr>
+              <w:t>.378</w:t>
+            </w:r>
+          </w:p>
+        </w:tc>
+      </w:tr>
+      <w:tr>
+        <w:trPr>
+          <w:cantSplit/>
+        </w:trPr>
+        <w:tc>
+          <w:tcPr>
+            <w:tcW w:type="dxa" w:w="2835"/>
+          </w:tcPr>
+          <w:p>
+            <w:pPr>
+              <w:keepNext/>
+              <w:spacing w:before="0" w:after="0" w:line="260" w:lineRule="exact"/>
+              <w:jc w:val="left"/>
+            </w:pPr>
+            <w:r>
+              <w:rPr>
+                <w:rFonts w:ascii="Times New Roman" w:hAnsi="Times New Roman" w:cs="Times New Roman" w:eastAsia="標楷體"/>
+                <w:b w:val="0"/>
+                <w:color w:val="17212B"/>
+                <w:sz w:val="19"/>
+              </w:rPr>
+              <w:t>反應時間 × 干擾分數</w:t>
+            </w:r>
+          </w:p>
+        </w:tc>
+        <w:tc>
+          <w:tcPr>
+            <w:tcW w:type="dxa" w:w="1134"/>
+          </w:tcPr>
+          <w:p>
+            <w:pPr>
+              <w:keepNext/>
+              <w:spacing w:before="0" w:after="0" w:line="260" w:lineRule="exact"/>
+              <w:jc w:val="center"/>
+            </w:pPr>
+            <w:r>
+              <w:rPr>
+                <w:rFonts w:ascii="Times New Roman" w:hAnsi="Times New Roman" w:cs="Times New Roman" w:eastAsia="標楷體"/>
+                <w:b w:val="0"/>
+                <w:color w:val="17212B"/>
+                <w:sz w:val="19"/>
+              </w:rPr>
+              <w:t>+0.24</w:t>
+            </w:r>
+          </w:p>
+        </w:tc>
+        <w:tc>
+          <w:tcPr>
+            <w:tcW w:type="dxa" w:w="1701"/>
+          </w:tcPr>
+          <w:p>
+            <w:pPr>
+              <w:keepNext/>
+              <w:spacing w:before="0" w:after="0" w:line="260" w:lineRule="exact"/>
+              <w:jc w:val="center"/>
+            </w:pPr>
+            <w:r>
+              <w:rPr>
+                <w:rFonts w:ascii="Times New Roman" w:hAnsi="Times New Roman" w:cs="Times New Roman" w:eastAsia="標楷體"/>
+                <w:b w:val="0"/>
+                <w:color w:val="17212B"/>
+                <w:sz w:val="19"/>
+              </w:rPr>
+              <w:t>128／12</w:t>
+            </w:r>
+          </w:p>
+        </w:tc>
+        <w:tc>
+          <w:tcPr>
+            <w:tcW w:type="dxa" w:w="1417"/>
+          </w:tcPr>
+          <w:p>
+            <w:pPr>
+              <w:keepNext/>
+              <w:spacing w:before="0" w:after="0" w:line="260" w:lineRule="exact"/>
+              <w:jc w:val="center"/>
+            </w:pPr>
+            <w:r>
+              <w:rPr>
+                <w:rFonts w:ascii="Times New Roman" w:hAnsi="Times New Roman" w:cs="Times New Roman" w:eastAsia="標楷體"/>
+                <w:b w:val="0"/>
+                <w:color w:val="17212B"/>
+                <w:sz w:val="19"/>
+              </w:rPr>
+              <w:t>.009</w:t>
+            </w:r>
+          </w:p>
+        </w:tc>
+        <w:tc>
+          <w:tcPr>
+            <w:tcW w:type="dxa" w:w="1701"/>
+          </w:tcPr>
+          <w:p>
+            <w:pPr>
+              <w:keepNext/>
+              <w:spacing w:before="0" w:after="0" w:line="260" w:lineRule="exact"/>
+              <w:jc w:val="center"/>
+            </w:pPr>
+            <w:r>
+              <w:rPr>
+                <w:rFonts w:ascii="Times New Roman" w:hAnsi="Times New Roman" w:cs="Times New Roman" w:eastAsia="標楷體"/>
+                <w:b w:val="0"/>
+                <w:color w:val="17212B"/>
+                <w:sz w:val="19"/>
+              </w:rPr>
+              <w:t>.220</w:t>
+            </w:r>
+          </w:p>
+        </w:tc>
+      </w:tr>
+      <w:tr>
+        <w:trPr>
+          <w:cantSplit/>
+        </w:trPr>
+        <w:tc>
+          <w:tcPr>
+            <w:tcW w:type="dxa" w:w="2835"/>
+          </w:tcPr>
+          <w:p>
+            <w:pPr>
+              <w:spacing w:before="0" w:after="0" w:line="260" w:lineRule="exact"/>
+              <w:jc w:val="left"/>
+            </w:pPr>
+            <w:r>
+              <w:rPr>
+                <w:rFonts w:ascii="Times New Roman" w:hAnsi="Times New Roman" w:cs="Times New Roman" w:eastAsia="標楷體"/>
+                <w:b w:val="0"/>
+                <w:color w:val="17212B"/>
+                <w:sz w:val="19"/>
+              </w:rPr>
+              <w:t>反應時間 × 瞬時心率</w:t>
+            </w:r>
+          </w:p>
+        </w:tc>
+        <w:tc>
+          <w:tcPr>
+            <w:tcW w:type="dxa" w:w="1134"/>
+          </w:tcPr>
+          <w:p>
+            <w:pPr>
+              <w:spacing w:before="0" w:after="0" w:line="260" w:lineRule="exact"/>
+              <w:jc w:val="center"/>
+            </w:pPr>
+            <w:r>
+              <w:rPr>
+                <w:rFonts w:ascii="Times New Roman" w:hAnsi="Times New Roman" w:cs="Times New Roman" w:eastAsia="標楷體"/>
+                <w:b w:val="0"/>
+                <w:color w:val="17212B"/>
+                <w:sz w:val="19"/>
+              </w:rPr>
+              <w:t>-0.32</w:t>
+            </w:r>
+          </w:p>
+        </w:tc>
+        <w:tc>
+          <w:tcPr>
+            <w:tcW w:type="dxa" w:w="1701"/>
+          </w:tcPr>
+          <w:p>
+            <w:pPr>
+              <w:spacing w:before="0" w:after="0" w:line="260" w:lineRule="exact"/>
+              <w:jc w:val="center"/>
+            </w:pPr>
+            <w:r>
+              <w:rPr>
+                <w:rFonts w:ascii="Times New Roman" w:hAnsi="Times New Roman" w:cs="Times New Roman" w:eastAsia="標楷體"/>
+                <w:b w:val="0"/>
+                <w:color w:val="17212B"/>
+                <w:sz w:val="19"/>
+              </w:rPr>
+              <w:t>55／12</w:t>
+            </w:r>
+          </w:p>
+        </w:tc>
+        <w:tc>
+          <w:tcPr>
+            <w:tcW w:type="dxa" w:w="1417"/>
+          </w:tcPr>
+          <w:p>
+            <w:pPr>
+              <w:spacing w:before="0" w:after="0" w:line="260" w:lineRule="exact"/>
+              <w:jc w:val="center"/>
+            </w:pPr>
+            <w:r>
+              <w:rPr>
+                <w:rFonts w:ascii="Times New Roman" w:hAnsi="Times New Roman" w:cs="Times New Roman" w:eastAsia="標楷體"/>
+                <w:b w:val="0"/>
+                <w:color w:val="17212B"/>
+                <w:sz w:val="19"/>
+              </w:rPr>
+              <w:t>.025</w:t>
+            </w:r>
+          </w:p>
+        </w:tc>
+        <w:tc>
+          <w:tcPr>
+            <w:tcW w:type="dxa" w:w="1701"/>
+          </w:tcPr>
+          <w:p>
+            <w:pPr>
+              <w:spacing w:before="0" w:after="0" w:line="260" w:lineRule="exact"/>
+              <w:jc w:val="center"/>
+            </w:pPr>
+            <w:r>
+              <w:rPr>
+                <w:rFonts w:ascii="Times New Roman" w:hAnsi="Times New Roman" w:cs="Times New Roman" w:eastAsia="標楷體"/>
+                <w:b w:val="0"/>
+                <w:color w:val="17212B"/>
+                <w:sz w:val="19"/>
+              </w:rPr>
+              <w:t>.312</w:t>
+            </w:r>
+          </w:p>
+        </w:tc>
+      </w:tr>
+    </w:tbl>
+    <w:p>
+      <w:pPr>
+        <w:spacing w:after="40"/>
+      </w:pPr>
+    </w:p>
+    <w:p>
+      <w:pPr>
+        <w:spacing w:before="0" w:after="40" w:line="340" w:lineRule="exact"/>
+        <w:ind w:left="340" w:hanging="227"/>
+      </w:pPr>
+      <w:r>
+        <w:rPr>
+          <w:rFonts w:ascii="Times New Roman" w:hAnsi="Times New Roman" w:cs="Times New Roman" w:eastAsia="標楷體"/>
+          <w:b w:val="0"/>
+          <w:color w:val="17212B"/>
+          <w:sz w:val="21"/>
+        </w:rPr>
+        <w:t>・這幾組在校正後都不顯著，只能當作「值得之後再確認的方向」，不能當作結論。</w:t>
+      </w:r>
+    </w:p>
+    <w:p>
+      <w:pPr>
+        <w:spacing w:before="0" w:after="40" w:line="340" w:lineRule="exact"/>
+        <w:ind w:left="340" w:hanging="227"/>
+      </w:pPr>
+      <w:r>
+        <w:rPr>
+          <w:rFonts w:ascii="Times New Roman" w:hAnsi="Times New Roman" w:cs="Times New Roman" w:eastAsia="標楷體"/>
+          <w:b w:val="0"/>
+          <w:color w:val="17212B"/>
+          <w:sz w:val="21"/>
+        </w:rPr>
+        <w:t>・心率變異度與其他變項都樣本不足：同一位學生至少要有 2 節課的資料才能算個人內相關，符合的只有 4 人。</w:t>
+      </w:r>
+    </w:p>
+    <w:p>
+      <w:pPr>
+        <w:spacing w:before="0" w:after="40" w:line="340" w:lineRule="exact"/>
+        <w:ind w:left="340" w:hanging="227"/>
+      </w:pPr>
+      <w:r>
+        <w:rPr>
+          <w:rFonts w:ascii="Times New Roman" w:hAnsi="Times New Roman" w:cs="Times New Roman" w:eastAsia="標楷體"/>
+          <w:b w:val="0"/>
+          <w:color w:val="17212B"/>
+          <w:sz w:val="21"/>
+        </w:rPr>
+        <w:t>・樣本數決定能偵測多小的相關：約 100 筆時，80% 檢定力只能偵測 |ρ| ≥ 0.27 左右；心率約 70 筆時要 |ρ| ≥ 0.36。比這更弱的相關，就算真的存在也測不出來。</w:t>
+      </w:r>
+    </w:p>
+    <w:p>
+      <w:pPr>
+        <w:spacing w:before="0" w:after="40" w:line="340" w:lineRule="exact"/>
+      </w:pPr>
+      <w:r>
+        <w:rPr>
+          <w:rFonts w:ascii="Times New Roman" w:hAnsi="Times New Roman" w:cs="Times New Roman" w:eastAsia="標楷體"/>
+          <w:b/>
+          <w:color w:val="17212B"/>
+          <w:sz w:val="22"/>
+        </w:rPr>
+        <w:t>怎麼讀 Spearman 結果</w:t>
+      </w:r>
+    </w:p>
+    <w:p>
+      <w:pPr>
+        <w:spacing w:before="0" w:after="40" w:line="340" w:lineRule="exact"/>
+        <w:ind w:left="340" w:hanging="227"/>
+      </w:pPr>
+      <w:r>
+        <w:rPr>
+          <w:rFonts w:ascii="Times New Roman" w:hAnsi="Times New Roman" w:cs="Times New Roman" w:eastAsia="標楷體"/>
+          <w:b w:val="0"/>
+          <w:color w:val="17212B"/>
+          <w:sz w:val="21"/>
+        </w:rPr>
+        <w:t>・ρ（rho）介於 −1 到 +1。正值＝一個變項排序較高時，另一個也傾向較高；負值＝相反；0＝沒有關係。</w:t>
+      </w:r>
+    </w:p>
+    <w:p>
+      <w:pPr>
+        <w:spacing w:before="0" w:after="40" w:line="340" w:lineRule="exact"/>
+        <w:ind w:left="340" w:hanging="227"/>
+      </w:pPr>
+      <w:r>
+        <w:rPr>
+          <w:rFonts w:ascii="Times New Roman" w:hAnsi="Times New Roman" w:cs="Times New Roman" w:eastAsia="標楷體"/>
+          <w:b w:val="0"/>
+          <w:color w:val="17212B"/>
+          <w:sz w:val="21"/>
+        </w:rPr>
+        <w:t>・強度的常用粗略分級：|ρ| &lt; 0.1 幾乎沒有、0.1–0.3 弱、0.3–0.5 中等、≥ 0.5 強。</w:t>
+      </w:r>
+    </w:p>
+    <w:p>
+      <w:pPr>
+        <w:spacing w:before="0" w:after="40" w:line="340" w:lineRule="exact"/>
+        <w:ind w:left="340" w:hanging="227"/>
+      </w:pPr>
+      <w:r>
+        <w:rPr>
+          <w:rFonts w:ascii="Times New Roman" w:hAnsi="Times New Roman" w:cs="Times New Roman" w:eastAsia="標楷體"/>
+          <w:b w:val="0"/>
+          <w:color w:val="17212B"/>
+          <w:sz w:val="21"/>
+        </w:rPr>
+        <w:t>・p 值：如果其實沒有相關，碰巧得到這麼強（或更強）ρ 的機率。p &lt; .05 視為顯著；同時檢定很多組時要看校正後的 p。</w:t>
+      </w:r>
+    </w:p>
+    <w:p>
+      <w:pPr>
+        <w:spacing w:before="0" w:after="40" w:line="340" w:lineRule="exact"/>
+        <w:ind w:left="340" w:hanging="227"/>
+      </w:pPr>
+      <w:r>
+        <w:rPr>
+          <w:rFonts w:ascii="Times New Roman" w:hAnsi="Times New Roman" w:cs="Times New Roman" w:eastAsia="標楷體"/>
+          <w:b w:val="0"/>
+          <w:color w:val="17212B"/>
+          <w:sz w:val="21"/>
+        </w:rPr>
+        <w:t>・相關不代表因果：例如 CO₂ 與疲勞的相關，也可能是因為兩者都和「下午、開冷氣」有關。</w:t>
+      </w:r>
+    </w:p>
     <w:sectPr>
       <w:pgSz w:w="11906" w:h="16838"/>
       <w:pgMar w:top="1134" w:right="1134" w:bottom="1134" w:left="1134" w:header="720" w:footer="720" w:gutter="0"/>

</xml_diff>

<commit_message>
Add multilevel mediation path analysis (fatigue / heart-rate / serial) with student-cluster bootstrap; report section 8
Co-Authored-By: Claude Opus 5.5 <noreply@anthropic.com>
</commit_message>
<xml_diff>
--- a/results/LMM/LMM 分析結果.docx
+++ b/results/LMM/LMM 分析結果.docx
@@ -5987,6 +5987,1411 @@
         <w:t>・相關不代表因果：例如 CO₂ 與疲勞的相關，也可能是因為兩者都和「下午、開冷氣」有關。</w:t>
       </w:r>
     </w:p>
+    <w:p>
+      <w:pPr>
+        <w:keepNext/>
+        <w:pageBreakBefore/>
+        <w:spacing w:before="0" w:after="80" w:line="300" w:lineRule="auto"/>
+      </w:pPr>
+      <w:r>
+        <w:rPr>
+          <w:rFonts w:ascii="Times New Roman" w:hAnsi="Times New Roman" w:cs="Times New Roman" w:eastAsia="標楷體"/>
+          <w:b/>
+          <w:color w:val="0D7468"/>
+          <w:sz w:val="28"/>
+        </w:rPr>
+        <w:t>八、徑路分析（中介效果）</w:t>
+      </w:r>
+    </w:p>
+    <w:p>
+      <w:pPr>
+        <w:spacing w:before="0" w:after="80" w:line="340" w:lineRule="exact"/>
+      </w:pPr>
+      <w:r>
+        <w:rPr>
+          <w:rFonts w:ascii="Times New Roman" w:hAnsi="Times New Roman" w:cs="Times New Roman" w:eastAsia="標楷體"/>
+          <w:b w:val="0"/>
+          <w:color w:val="17212B"/>
+          <w:sz w:val="22"/>
+        </w:rPr>
+        <w:t>檢查環境是否「透過」某個中介因子影響結果，例如 CO₂ → 疲勞 → 反應時間。間接效果 ＝ a（環境 → 中介）× b（中介 → 結果，已控制環境）。只要 a 或 b 其中一條不成立，中介就不成立。</w:t>
+      </w:r>
+    </w:p>
+    <w:p>
+      <w:pPr>
+        <w:keepNext/>
+        <w:spacing w:before="0" w:after="80" w:line="340" w:lineRule="exact"/>
+      </w:pPr>
+      <w:r>
+        <w:rPr>
+          <w:rFonts w:ascii="Times New Roman" w:hAnsi="Times New Roman" w:cs="Times New Roman" w:eastAsia="標楷體"/>
+          <w:b w:val="0"/>
+          <w:color w:val="17212B"/>
+          <w:sz w:val="22"/>
+        </w:rPr>
+        <w:t>表 5　候選路徑與樣本數。中介分析需要同一人次同時有環境、中介因子與結果；兩條路徑都是中等效果時，約需 70–80 人次才有 80% 檢定力（Fritz &amp; MacKinnon, 2007）：</w:t>
+      </w:r>
+    </w:p>
+    <w:tbl>
+      <w:tblPr>
+        <w:tblStyle w:val="TableGrid"/>
+        <w:tblW w:type="auto" w:w="0"/>
+        <w:jc w:val="center"/>
+        <w:tblLook w:firstColumn="1" w:firstRow="1" w:lastColumn="0" w:lastRow="0" w:noHBand="0" w:noVBand="1" w:val="04A0"/>
+      </w:tblPr>
+      <w:tblGrid>
+        <w:gridCol w:w="2409"/>
+        <w:gridCol w:w="2409"/>
+        <w:gridCol w:w="2409"/>
+        <w:gridCol w:w="2409"/>
+      </w:tblGrid>
+      <w:tr>
+        <w:trPr>
+          <w:cantSplit/>
+        </w:trPr>
+        <w:tc>
+          <w:tcPr>
+            <w:tcW w:type="dxa" w:w="3402"/>
+            <w:shd w:val="clear" w:fill="E6F2F0"/>
+          </w:tcPr>
+          <w:p>
+            <w:pPr>
+              <w:keepNext/>
+              <w:spacing w:before="0" w:after="0" w:line="260" w:lineRule="exact"/>
+              <w:jc w:val="left"/>
+            </w:pPr>
+            <w:r>
+              <w:rPr>
+                <w:rFonts w:ascii="Times New Roman" w:hAnsi="Times New Roman" w:cs="Times New Roman" w:eastAsia="標楷體"/>
+                <w:b/>
+                <w:color w:val="17212B"/>
+                <w:sz w:val="19"/>
+              </w:rPr>
+              <w:t>路徑</w:t>
+            </w:r>
+          </w:p>
+        </w:tc>
+        <w:tc>
+          <w:tcPr>
+            <w:tcW w:type="dxa" w:w="1020"/>
+            <w:shd w:val="clear" w:fill="E6F2F0"/>
+          </w:tcPr>
+          <w:p>
+            <w:pPr>
+              <w:keepNext/>
+              <w:spacing w:before="0" w:after="0" w:line="260" w:lineRule="exact"/>
+              <w:jc w:val="center"/>
+            </w:pPr>
+            <w:r>
+              <w:rPr>
+                <w:rFonts w:ascii="Times New Roman" w:hAnsi="Times New Roman" w:cs="Times New Roman" w:eastAsia="標楷體"/>
+                <w:b/>
+                <w:color w:val="17212B"/>
+                <w:sz w:val="19"/>
+              </w:rPr>
+              <w:t>人次</w:t>
+            </w:r>
+          </w:p>
+        </w:tc>
+        <w:tc>
+          <w:tcPr>
+            <w:tcW w:type="dxa" w:w="1020"/>
+            <w:shd w:val="clear" w:fill="E6F2F0"/>
+          </w:tcPr>
+          <w:p>
+            <w:pPr>
+              <w:keepNext/>
+              <w:spacing w:before="0" w:after="0" w:line="260" w:lineRule="exact"/>
+              <w:jc w:val="center"/>
+            </w:pPr>
+            <w:r>
+              <w:rPr>
+                <w:rFonts w:ascii="Times New Roman" w:hAnsi="Times New Roman" w:cs="Times New Roman" w:eastAsia="標楷體"/>
+                <w:b/>
+                <w:color w:val="17212B"/>
+                <w:sz w:val="19"/>
+              </w:rPr>
+              <w:t>學生</w:t>
+            </w:r>
+          </w:p>
+        </w:tc>
+        <w:tc>
+          <w:tcPr>
+            <w:tcW w:type="dxa" w:w="4195"/>
+            <w:shd w:val="clear" w:fill="E6F2F0"/>
+          </w:tcPr>
+          <w:p>
+            <w:pPr>
+              <w:keepNext/>
+              <w:spacing w:before="0" w:after="0" w:line="260" w:lineRule="exact"/>
+              <w:jc w:val="center"/>
+            </w:pPr>
+            <w:r>
+              <w:rPr>
+                <w:rFonts w:ascii="Times New Roman" w:hAnsi="Times New Roman" w:cs="Times New Roman" w:eastAsia="標楷體"/>
+                <w:b/>
+                <w:color w:val="17212B"/>
+                <w:sz w:val="19"/>
+              </w:rPr>
+              <w:t>判斷</w:t>
+            </w:r>
+          </w:p>
+        </w:tc>
+      </w:tr>
+      <w:tr>
+        <w:trPr>
+          <w:cantSplit/>
+        </w:trPr>
+        <w:tc>
+          <w:tcPr>
+            <w:tcW w:type="dxa" w:w="3402"/>
+          </w:tcPr>
+          <w:p>
+            <w:pPr>
+              <w:keepNext/>
+              <w:spacing w:before="0" w:after="0" w:line="260" w:lineRule="exact"/>
+              <w:jc w:val="left"/>
+            </w:pPr>
+            <w:r>
+              <w:rPr>
+                <w:rFonts w:ascii="Times New Roman" w:hAnsi="Times New Roman" w:cs="Times New Roman" w:eastAsia="標楷體"/>
+                <w:b w:val="0"/>
+                <w:color w:val="17212B"/>
+                <w:sz w:val="19"/>
+              </w:rPr>
+              <w:t>環境 → 疲勞 → Stroop</w:t>
+            </w:r>
+          </w:p>
+        </w:tc>
+        <w:tc>
+          <w:tcPr>
+            <w:tcW w:type="dxa" w:w="1020"/>
+          </w:tcPr>
+          <w:p>
+            <w:pPr>
+              <w:keepNext/>
+              <w:spacing w:before="0" w:after="0" w:line="260" w:lineRule="exact"/>
+              <w:jc w:val="center"/>
+            </w:pPr>
+            <w:r>
+              <w:rPr>
+                <w:rFonts w:ascii="Times New Roman" w:hAnsi="Times New Roman" w:cs="Times New Roman" w:eastAsia="標楷體"/>
+                <w:b w:val="0"/>
+                <w:color w:val="17212B"/>
+                <w:sz w:val="19"/>
+              </w:rPr>
+              <w:t>96</w:t>
+            </w:r>
+          </w:p>
+        </w:tc>
+        <w:tc>
+          <w:tcPr>
+            <w:tcW w:type="dxa" w:w="1020"/>
+          </w:tcPr>
+          <w:p>
+            <w:pPr>
+              <w:keepNext/>
+              <w:spacing w:before="0" w:after="0" w:line="260" w:lineRule="exact"/>
+              <w:jc w:val="center"/>
+            </w:pPr>
+            <w:r>
+              <w:rPr>
+                <w:rFonts w:ascii="Times New Roman" w:hAnsi="Times New Roman" w:cs="Times New Roman" w:eastAsia="標楷體"/>
+                <w:b w:val="0"/>
+                <w:color w:val="17212B"/>
+                <w:sz w:val="19"/>
+              </w:rPr>
+              <w:t>11</w:t>
+            </w:r>
+          </w:p>
+        </w:tc>
+        <w:tc>
+          <w:tcPr>
+            <w:tcW w:type="dxa" w:w="4195"/>
+          </w:tcPr>
+          <w:p>
+            <w:pPr>
+              <w:keepNext/>
+              <w:spacing w:before="0" w:after="0" w:line="260" w:lineRule="exact"/>
+              <w:jc w:val="center"/>
+            </w:pPr>
+            <w:r>
+              <w:rPr>
+                <w:rFonts w:ascii="Times New Roman" w:hAnsi="Times New Roman" w:cs="Times New Roman" w:eastAsia="標楷體"/>
+                <w:b w:val="0"/>
+                <w:color w:val="17212B"/>
+                <w:sz w:val="19"/>
+              </w:rPr>
+              <w:t>可做</w:t>
+            </w:r>
+          </w:p>
+        </w:tc>
+      </w:tr>
+      <w:tr>
+        <w:trPr>
+          <w:cantSplit/>
+        </w:trPr>
+        <w:tc>
+          <w:tcPr>
+            <w:tcW w:type="dxa" w:w="3402"/>
+          </w:tcPr>
+          <w:p>
+            <w:pPr>
+              <w:keepNext/>
+              <w:spacing w:before="0" w:after="0" w:line="260" w:lineRule="exact"/>
+              <w:jc w:val="left"/>
+            </w:pPr>
+            <w:r>
+              <w:rPr>
+                <w:rFonts w:ascii="Times New Roman" w:hAnsi="Times New Roman" w:cs="Times New Roman" w:eastAsia="標楷體"/>
+                <w:b w:val="0"/>
+                <w:color w:val="17212B"/>
+                <w:sz w:val="19"/>
+              </w:rPr>
+              <w:t>環境 → 心率 → Stroop</w:t>
+            </w:r>
+          </w:p>
+        </w:tc>
+        <w:tc>
+          <w:tcPr>
+            <w:tcW w:type="dxa" w:w="1020"/>
+          </w:tcPr>
+          <w:p>
+            <w:pPr>
+              <w:keepNext/>
+              <w:spacing w:before="0" w:after="0" w:line="260" w:lineRule="exact"/>
+              <w:jc w:val="center"/>
+            </w:pPr>
+            <w:r>
+              <w:rPr>
+                <w:rFonts w:ascii="Times New Roman" w:hAnsi="Times New Roman" w:cs="Times New Roman" w:eastAsia="標楷體"/>
+                <w:b w:val="0"/>
+                <w:color w:val="17212B"/>
+                <w:sz w:val="19"/>
+              </w:rPr>
+              <w:t>52</w:t>
+            </w:r>
+          </w:p>
+        </w:tc>
+        <w:tc>
+          <w:tcPr>
+            <w:tcW w:type="dxa" w:w="1020"/>
+          </w:tcPr>
+          <w:p>
+            <w:pPr>
+              <w:keepNext/>
+              <w:spacing w:before="0" w:after="0" w:line="260" w:lineRule="exact"/>
+              <w:jc w:val="center"/>
+            </w:pPr>
+            <w:r>
+              <w:rPr>
+                <w:rFonts w:ascii="Times New Roman" w:hAnsi="Times New Roman" w:cs="Times New Roman" w:eastAsia="標楷體"/>
+                <w:b w:val="0"/>
+                <w:color w:val="17212B"/>
+                <w:sz w:val="19"/>
+              </w:rPr>
+              <w:t>12</w:t>
+            </w:r>
+          </w:p>
+        </w:tc>
+        <w:tc>
+          <w:tcPr>
+            <w:tcW w:type="dxa" w:w="4195"/>
+          </w:tcPr>
+          <w:p>
+            <w:pPr>
+              <w:keepNext/>
+              <w:spacing w:before="0" w:after="0" w:line="260" w:lineRule="exact"/>
+              <w:jc w:val="center"/>
+            </w:pPr>
+            <w:r>
+              <w:rPr>
+                <w:rFonts w:ascii="Times New Roman" w:hAnsi="Times New Roman" w:cs="Times New Roman" w:eastAsia="標楷體"/>
+                <w:b w:val="0"/>
+                <w:color w:val="17212B"/>
+                <w:sz w:val="19"/>
+              </w:rPr>
+              <w:t>可做（樣本偏小，只能偵測較大的效果）</w:t>
+            </w:r>
+          </w:p>
+        </w:tc>
+      </w:tr>
+      <w:tr>
+        <w:trPr>
+          <w:cantSplit/>
+        </w:trPr>
+        <w:tc>
+          <w:tcPr>
+            <w:tcW w:type="dxa" w:w="3402"/>
+          </w:tcPr>
+          <w:p>
+            <w:pPr>
+              <w:keepNext/>
+              <w:spacing w:before="0" w:after="0" w:line="260" w:lineRule="exact"/>
+              <w:jc w:val="left"/>
+            </w:pPr>
+            <w:r>
+              <w:rPr>
+                <w:rFonts w:ascii="Times New Roman" w:hAnsi="Times New Roman" w:cs="Times New Roman" w:eastAsia="標楷體"/>
+                <w:b w:val="0"/>
+                <w:color w:val="17212B"/>
+                <w:sz w:val="19"/>
+              </w:rPr>
+              <w:t>環境 → 心率 → 疲勞</w:t>
+            </w:r>
+          </w:p>
+        </w:tc>
+        <w:tc>
+          <w:tcPr>
+            <w:tcW w:type="dxa" w:w="1020"/>
+          </w:tcPr>
+          <w:p>
+            <w:pPr>
+              <w:keepNext/>
+              <w:spacing w:before="0" w:after="0" w:line="260" w:lineRule="exact"/>
+              <w:jc w:val="center"/>
+            </w:pPr>
+            <w:r>
+              <w:rPr>
+                <w:rFonts w:ascii="Times New Roman" w:hAnsi="Times New Roman" w:cs="Times New Roman" w:eastAsia="標楷體"/>
+                <w:b w:val="0"/>
+                <w:color w:val="17212B"/>
+                <w:sz w:val="19"/>
+              </w:rPr>
+              <w:t>46</w:t>
+            </w:r>
+          </w:p>
+        </w:tc>
+        <w:tc>
+          <w:tcPr>
+            <w:tcW w:type="dxa" w:w="1020"/>
+          </w:tcPr>
+          <w:p>
+            <w:pPr>
+              <w:keepNext/>
+              <w:spacing w:before="0" w:after="0" w:line="260" w:lineRule="exact"/>
+              <w:jc w:val="center"/>
+            </w:pPr>
+            <w:r>
+              <w:rPr>
+                <w:rFonts w:ascii="Times New Roman" w:hAnsi="Times New Roman" w:cs="Times New Roman" w:eastAsia="標楷體"/>
+                <w:b w:val="0"/>
+                <w:color w:val="17212B"/>
+                <w:sz w:val="19"/>
+              </w:rPr>
+              <w:t>10</w:t>
+            </w:r>
+          </w:p>
+        </w:tc>
+        <w:tc>
+          <w:tcPr>
+            <w:tcW w:type="dxa" w:w="4195"/>
+          </w:tcPr>
+          <w:p>
+            <w:pPr>
+              <w:keepNext/>
+              <w:spacing w:before="0" w:after="0" w:line="260" w:lineRule="exact"/>
+              <w:jc w:val="center"/>
+            </w:pPr>
+            <w:r>
+              <w:rPr>
+                <w:rFonts w:ascii="Times New Roman" w:hAnsi="Times New Roman" w:cs="Times New Roman" w:eastAsia="標楷體"/>
+                <w:b w:val="0"/>
+                <w:color w:val="17212B"/>
+                <w:sz w:val="19"/>
+              </w:rPr>
+              <w:t>可做（樣本偏小，只能偵測較大的效果）</w:t>
+            </w:r>
+          </w:p>
+        </w:tc>
+      </w:tr>
+      <w:tr>
+        <w:trPr>
+          <w:cantSplit/>
+        </w:trPr>
+        <w:tc>
+          <w:tcPr>
+            <w:tcW w:type="dxa" w:w="3402"/>
+          </w:tcPr>
+          <w:p>
+            <w:pPr>
+              <w:keepNext/>
+              <w:spacing w:before="0" w:after="0" w:line="260" w:lineRule="exact"/>
+              <w:jc w:val="left"/>
+            </w:pPr>
+            <w:r>
+              <w:rPr>
+                <w:rFonts w:ascii="Times New Roman" w:hAnsi="Times New Roman" w:cs="Times New Roman" w:eastAsia="標楷體"/>
+                <w:b w:val="0"/>
+                <w:color w:val="17212B"/>
+                <w:sz w:val="19"/>
+              </w:rPr>
+              <w:t>環境 → 心率 → 疲勞 → Stroop</w:t>
+            </w:r>
+          </w:p>
+        </w:tc>
+        <w:tc>
+          <w:tcPr>
+            <w:tcW w:type="dxa" w:w="1020"/>
+          </w:tcPr>
+          <w:p>
+            <w:pPr>
+              <w:keepNext/>
+              <w:spacing w:before="0" w:after="0" w:line="260" w:lineRule="exact"/>
+              <w:jc w:val="center"/>
+            </w:pPr>
+            <w:r>
+              <w:rPr>
+                <w:rFonts w:ascii="Times New Roman" w:hAnsi="Times New Roman" w:cs="Times New Roman" w:eastAsia="標楷體"/>
+                <w:b w:val="0"/>
+                <w:color w:val="17212B"/>
+                <w:sz w:val="19"/>
+              </w:rPr>
+              <w:t>43</w:t>
+            </w:r>
+          </w:p>
+        </w:tc>
+        <w:tc>
+          <w:tcPr>
+            <w:tcW w:type="dxa" w:w="1020"/>
+          </w:tcPr>
+          <w:p>
+            <w:pPr>
+              <w:keepNext/>
+              <w:spacing w:before="0" w:after="0" w:line="260" w:lineRule="exact"/>
+              <w:jc w:val="center"/>
+            </w:pPr>
+            <w:r>
+              <w:rPr>
+                <w:rFonts w:ascii="Times New Roman" w:hAnsi="Times New Roman" w:cs="Times New Roman" w:eastAsia="標楷體"/>
+                <w:b w:val="0"/>
+                <w:color w:val="17212B"/>
+                <w:sz w:val="19"/>
+              </w:rPr>
+              <w:t>10</w:t>
+            </w:r>
+          </w:p>
+        </w:tc>
+        <w:tc>
+          <w:tcPr>
+            <w:tcW w:type="dxa" w:w="4195"/>
+          </w:tcPr>
+          <w:p>
+            <w:pPr>
+              <w:keepNext/>
+              <w:spacing w:before="0" w:after="0" w:line="260" w:lineRule="exact"/>
+              <w:jc w:val="center"/>
+            </w:pPr>
+            <w:r>
+              <w:rPr>
+                <w:rFonts w:ascii="Times New Roman" w:hAnsi="Times New Roman" w:cs="Times New Roman" w:eastAsia="標楷體"/>
+                <w:b w:val="0"/>
+                <w:color w:val="17212B"/>
+                <w:sz w:val="19"/>
+              </w:rPr>
+              <w:t>可做（樣本偏小，只能偵測較大的效果）</w:t>
+            </w:r>
+          </w:p>
+        </w:tc>
+      </w:tr>
+      <w:tr>
+        <w:trPr>
+          <w:cantSplit/>
+        </w:trPr>
+        <w:tc>
+          <w:tcPr>
+            <w:tcW w:type="dxa" w:w="3402"/>
+          </w:tcPr>
+          <w:p>
+            <w:pPr>
+              <w:keepNext/>
+              <w:spacing w:before="0" w:after="0" w:line="260" w:lineRule="exact"/>
+              <w:jc w:val="left"/>
+            </w:pPr>
+            <w:r>
+              <w:rPr>
+                <w:rFonts w:ascii="Times New Roman" w:hAnsi="Times New Roman" w:cs="Times New Roman" w:eastAsia="標楷體"/>
+                <w:b w:val="0"/>
+                <w:color w:val="17212B"/>
+                <w:sz w:val="19"/>
+              </w:rPr>
+              <w:t>環境 → 心率變異度 → Stroop</w:t>
+            </w:r>
+          </w:p>
+        </w:tc>
+        <w:tc>
+          <w:tcPr>
+            <w:tcW w:type="dxa" w:w="1020"/>
+          </w:tcPr>
+          <w:p>
+            <w:pPr>
+              <w:keepNext/>
+              <w:spacing w:before="0" w:after="0" w:line="260" w:lineRule="exact"/>
+              <w:jc w:val="center"/>
+            </w:pPr>
+            <w:r>
+              <w:rPr>
+                <w:rFonts w:ascii="Times New Roman" w:hAnsi="Times New Roman" w:cs="Times New Roman" w:eastAsia="標楷體"/>
+                <w:b w:val="0"/>
+                <w:color w:val="17212B"/>
+                <w:sz w:val="19"/>
+              </w:rPr>
+              <w:t>18</w:t>
+            </w:r>
+          </w:p>
+        </w:tc>
+        <w:tc>
+          <w:tcPr>
+            <w:tcW w:type="dxa" w:w="1020"/>
+          </w:tcPr>
+          <w:p>
+            <w:pPr>
+              <w:keepNext/>
+              <w:spacing w:before="0" w:after="0" w:line="260" w:lineRule="exact"/>
+              <w:jc w:val="center"/>
+            </w:pPr>
+            <w:r>
+              <w:rPr>
+                <w:rFonts w:ascii="Times New Roman" w:hAnsi="Times New Roman" w:cs="Times New Roman" w:eastAsia="標楷體"/>
+                <w:b w:val="0"/>
+                <w:color w:val="17212B"/>
+                <w:sz w:val="19"/>
+              </w:rPr>
+              <w:t>6</w:t>
+            </w:r>
+          </w:p>
+        </w:tc>
+        <w:tc>
+          <w:tcPr>
+            <w:tcW w:type="dxa" w:w="4195"/>
+          </w:tcPr>
+          <w:p>
+            <w:pPr>
+              <w:keepNext/>
+              <w:spacing w:before="0" w:after="0" w:line="260" w:lineRule="exact"/>
+              <w:jc w:val="center"/>
+            </w:pPr>
+            <w:r>
+              <w:rPr>
+                <w:rFonts w:ascii="Times New Roman" w:hAnsi="Times New Roman" w:cs="Times New Roman" w:eastAsia="標楷體"/>
+                <w:b w:val="0"/>
+                <w:color w:val="17212B"/>
+                <w:sz w:val="19"/>
+              </w:rPr>
+              <w:t>樣本不足，不做</w:t>
+            </w:r>
+          </w:p>
+        </w:tc>
+      </w:tr>
+      <w:tr>
+        <w:trPr>
+          <w:cantSplit/>
+        </w:trPr>
+        <w:tc>
+          <w:tcPr>
+            <w:tcW w:type="dxa" w:w="3402"/>
+          </w:tcPr>
+          <w:p>
+            <w:pPr>
+              <w:keepNext/>
+              <w:spacing w:before="0" w:after="0" w:line="260" w:lineRule="exact"/>
+              <w:jc w:val="left"/>
+            </w:pPr>
+            <w:r>
+              <w:rPr>
+                <w:rFonts w:ascii="Times New Roman" w:hAnsi="Times New Roman" w:cs="Times New Roman" w:eastAsia="標楷體"/>
+                <w:b w:val="0"/>
+                <w:color w:val="17212B"/>
+                <w:sz w:val="19"/>
+              </w:rPr>
+              <w:t>環境 → 心率變異度 → 疲勞</w:t>
+            </w:r>
+          </w:p>
+        </w:tc>
+        <w:tc>
+          <w:tcPr>
+            <w:tcW w:type="dxa" w:w="1020"/>
+          </w:tcPr>
+          <w:p>
+            <w:pPr>
+              <w:keepNext/>
+              <w:spacing w:before="0" w:after="0" w:line="260" w:lineRule="exact"/>
+              <w:jc w:val="center"/>
+            </w:pPr>
+            <w:r>
+              <w:rPr>
+                <w:rFonts w:ascii="Times New Roman" w:hAnsi="Times New Roman" w:cs="Times New Roman" w:eastAsia="標楷體"/>
+                <w:b w:val="0"/>
+                <w:color w:val="17212B"/>
+                <w:sz w:val="19"/>
+              </w:rPr>
+              <w:t>13</w:t>
+            </w:r>
+          </w:p>
+        </w:tc>
+        <w:tc>
+          <w:tcPr>
+            <w:tcW w:type="dxa" w:w="1020"/>
+          </w:tcPr>
+          <w:p>
+            <w:pPr>
+              <w:keepNext/>
+              <w:spacing w:before="0" w:after="0" w:line="260" w:lineRule="exact"/>
+              <w:jc w:val="center"/>
+            </w:pPr>
+            <w:r>
+              <w:rPr>
+                <w:rFonts w:ascii="Times New Roman" w:hAnsi="Times New Roman" w:cs="Times New Roman" w:eastAsia="標楷體"/>
+                <w:b w:val="0"/>
+                <w:color w:val="17212B"/>
+                <w:sz w:val="19"/>
+              </w:rPr>
+              <w:t>5</w:t>
+            </w:r>
+          </w:p>
+        </w:tc>
+        <w:tc>
+          <w:tcPr>
+            <w:tcW w:type="dxa" w:w="4195"/>
+          </w:tcPr>
+          <w:p>
+            <w:pPr>
+              <w:keepNext/>
+              <w:spacing w:before="0" w:after="0" w:line="260" w:lineRule="exact"/>
+              <w:jc w:val="center"/>
+            </w:pPr>
+            <w:r>
+              <w:rPr>
+                <w:rFonts w:ascii="Times New Roman" w:hAnsi="Times New Roman" w:cs="Times New Roman" w:eastAsia="標楷體"/>
+                <w:b w:val="0"/>
+                <w:color w:val="17212B"/>
+                <w:sz w:val="19"/>
+              </w:rPr>
+              <w:t>樣本不足，不做</w:t>
+            </w:r>
+          </w:p>
+        </w:tc>
+      </w:tr>
+      <w:tr>
+        <w:trPr>
+          <w:cantSplit/>
+        </w:trPr>
+        <w:tc>
+          <w:tcPr>
+            <w:tcW w:type="dxa" w:w="3402"/>
+          </w:tcPr>
+          <w:p>
+            <w:pPr>
+              <w:spacing w:before="0" w:after="0" w:line="260" w:lineRule="exact"/>
+              <w:jc w:val="left"/>
+            </w:pPr>
+            <w:r>
+              <w:rPr>
+                <w:rFonts w:ascii="Times New Roman" w:hAnsi="Times New Roman" w:cs="Times New Roman" w:eastAsia="標楷體"/>
+                <w:b w:val="0"/>
+                <w:color w:val="17212B"/>
+                <w:sz w:val="19"/>
+              </w:rPr>
+              <w:t>環境 → 疲勞 → 心率變異度</w:t>
+            </w:r>
+          </w:p>
+        </w:tc>
+        <w:tc>
+          <w:tcPr>
+            <w:tcW w:type="dxa" w:w="1020"/>
+          </w:tcPr>
+          <w:p>
+            <w:pPr>
+              <w:spacing w:before="0" w:after="0" w:line="260" w:lineRule="exact"/>
+              <w:jc w:val="center"/>
+            </w:pPr>
+            <w:r>
+              <w:rPr>
+                <w:rFonts w:ascii="Times New Roman" w:hAnsi="Times New Roman" w:cs="Times New Roman" w:eastAsia="標楷體"/>
+                <w:b w:val="0"/>
+                <w:color w:val="17212B"/>
+                <w:sz w:val="19"/>
+              </w:rPr>
+              <w:t>13</w:t>
+            </w:r>
+          </w:p>
+        </w:tc>
+        <w:tc>
+          <w:tcPr>
+            <w:tcW w:type="dxa" w:w="1020"/>
+          </w:tcPr>
+          <w:p>
+            <w:pPr>
+              <w:spacing w:before="0" w:after="0" w:line="260" w:lineRule="exact"/>
+              <w:jc w:val="center"/>
+            </w:pPr>
+            <w:r>
+              <w:rPr>
+                <w:rFonts w:ascii="Times New Roman" w:hAnsi="Times New Roman" w:cs="Times New Roman" w:eastAsia="標楷體"/>
+                <w:b w:val="0"/>
+                <w:color w:val="17212B"/>
+                <w:sz w:val="19"/>
+              </w:rPr>
+              <w:t>5</w:t>
+            </w:r>
+          </w:p>
+        </w:tc>
+        <w:tc>
+          <w:tcPr>
+            <w:tcW w:type="dxa" w:w="4195"/>
+          </w:tcPr>
+          <w:p>
+            <w:pPr>
+              <w:spacing w:before="0" w:after="0" w:line="260" w:lineRule="exact"/>
+              <w:jc w:val="center"/>
+            </w:pPr>
+            <w:r>
+              <w:rPr>
+                <w:rFonts w:ascii="Times New Roman" w:hAnsi="Times New Roman" w:cs="Times New Roman" w:eastAsia="標楷體"/>
+                <w:b w:val="0"/>
+                <w:color w:val="17212B"/>
+                <w:sz w:val="19"/>
+              </w:rPr>
+              <w:t>樣本不足，不做</w:t>
+            </w:r>
+          </w:p>
+        </w:tc>
+      </w:tr>
+    </w:tbl>
+    <w:p>
+      <w:pPr>
+        <w:spacing w:after="40"/>
+      </w:pPr>
+    </w:p>
+    <w:p>
+      <w:pPr>
+        <w:spacing w:before="0" w:after="40" w:line="340" w:lineRule="exact"/>
+        <w:ind w:left="340" w:hanging="227"/>
+      </w:pPr>
+      <w:r>
+        <w:rPr>
+          <w:rFonts w:ascii="Times New Roman" w:hAnsi="Times New Roman" w:cs="Times New Roman" w:eastAsia="標楷體"/>
+          <w:b w:val="0"/>
+          <w:color w:val="17212B"/>
+          <w:sz w:val="21"/>
+        </w:rPr>
+        <w:t>・心率變異度的三條路徑都不到 20 人次，不做。</w:t>
+      </w:r>
+    </w:p>
+    <w:p>
+      <w:pPr>
+        <w:spacing w:before="0" w:after="40" w:line="340" w:lineRule="exact"/>
+        <w:ind w:left="340" w:hanging="227"/>
+      </w:pPr>
+      <w:r>
+        <w:rPr>
+          <w:rFonts w:ascii="Times New Roman" w:hAnsi="Times New Roman" w:cs="Times New Roman" w:eastAsia="標楷體"/>
+          <w:b w:val="0"/>
+          <w:color w:val="17212B"/>
+          <w:sz w:val="21"/>
+        </w:rPr>
+        <w:t>・每條方程式都是學生隨機截距 LMM，三個自變量同時放入，並控制人數與冷氣；疲勞的方程式另控制睡眠。變項都先標準化，係數為標準化 β。</w:t>
+      </w:r>
+    </w:p>
+    <w:p>
+      <w:pPr>
+        <w:spacing w:before="0" w:after="40" w:line="340" w:lineRule="exact"/>
+        <w:ind w:left="340" w:hanging="227"/>
+      </w:pPr>
+      <w:r>
+        <w:rPr>
+          <w:rFonts w:ascii="Times New Roman" w:hAnsi="Times New Roman" w:cs="Times New Roman" w:eastAsia="標楷體"/>
+          <w:b w:val="0"/>
+          <w:color w:val="17212B"/>
+          <w:sz w:val="21"/>
+        </w:rPr>
+        <w:t>・間接效果的 95% 信賴區間以「學生」為單位 bootstrap 重抽 2,000 次；區間不含 0 才算顯著。</w:t>
+      </w:r>
+    </w:p>
+    <w:p>
+      <w:pPr>
+        <w:keepNext/>
+        <w:spacing w:before="80" w:after="40" w:line="240" w:lineRule="auto"/>
+        <w:jc w:val="center"/>
+      </w:pPr>
+      <w:r>
+        <w:drawing>
+          <wp:inline xmlns:a="http://schemas.openxmlformats.org/drawingml/2006/main" xmlns:pic="http://schemas.openxmlformats.org/drawingml/2006/picture">
+            <wp:extent cx="5760000" cy="4268308"/>
+            <wp:docPr id="4" name="Picture 4"/>
+            <wp:cNvGraphicFramePr>
+              <a:graphicFrameLocks noChangeAspect="1"/>
+            </wp:cNvGraphicFramePr>
+            <a:graphic>
+              <a:graphicData uri="http://schemas.openxmlformats.org/drawingml/2006/picture">
+                <pic:pic>
+                  <pic:nvPicPr>
+                    <pic:cNvPr id="0" name="04_徑路分析.png"/>
+                    <pic:cNvPicPr/>
+                  </pic:nvPicPr>
+                  <pic:blipFill>
+                    <a:blip r:embed="rId12"/>
+                    <a:stretch>
+                      <a:fillRect/>
+                    </a:stretch>
+                  </pic:blipFill>
+                  <pic:spPr>
+                    <a:xfrm>
+                      <a:off x="0" y="0"/>
+                      <a:ext cx="5760000" cy="4268308"/>
+                    </a:xfrm>
+                    <a:prstGeom prst="rect"/>
+                  </pic:spPr>
+                </pic:pic>
+              </a:graphicData>
+            </a:graphic>
+          </wp:inline>
+        </w:drawing>
+      </w:r>
+    </w:p>
+    <w:p>
+      <w:pPr>
+        <w:spacing w:before="0" w:after="160" w:line="340" w:lineRule="exact"/>
+      </w:pPr>
+      <w:r>
+        <w:rPr>
+          <w:rFonts w:ascii="Times New Roman" w:hAnsi="Times New Roman" w:cs="Times New Roman" w:eastAsia="標楷體"/>
+          <w:b w:val="0"/>
+          <w:color w:val="5B6670"/>
+          <w:sz w:val="19"/>
+        </w:rPr>
+        <w:t>圖 4　四個中介模型。黑色實線為 bootstrap 95% CI 不含 0 的路徑，灰色虛線為含 0；環境 → 結果的直接效果只畫出顯著的。</w:t>
+      </w:r>
+    </w:p>
+    <w:p>
+      <w:pPr>
+        <w:keepNext/>
+        <w:spacing w:before="0" w:after="80" w:line="340" w:lineRule="exact"/>
+      </w:pPr>
+      <w:r>
+        <w:rPr>
+          <w:rFonts w:ascii="Times New Roman" w:hAnsi="Times New Roman" w:cs="Times New Roman" w:eastAsia="標楷體"/>
+          <w:b/>
+          <w:color w:val="17212B"/>
+          <w:sz w:val="22"/>
+        </w:rPr>
+        <w:t>結果</w:t>
+      </w:r>
+      <w:r>
+        <w:rPr>
+          <w:rFonts w:ascii="Times New Roman" w:hAnsi="Times New Roman" w:cs="Times New Roman" w:eastAsia="標楷體"/>
+          <w:b w:val="0"/>
+          <w:color w:val="17212B"/>
+          <w:sz w:val="22"/>
+        </w:rPr>
+        <w:t>：共檢驗 48 條間接路徑，</w:t>
+      </w:r>
+      <w:r>
+        <w:rPr>
+          <w:rFonts w:ascii="Times New Roman" w:hAnsi="Times New Roman" w:cs="Times New Roman" w:eastAsia="標楷體"/>
+          <w:b/>
+          <w:color w:val="17212B"/>
+          <w:sz w:val="22"/>
+        </w:rPr>
+        <w:t>沒有任何一條顯著</w:t>
+      </w:r>
+      <w:r>
+        <w:rPr>
+          <w:rFonts w:ascii="Times New Roman" w:hAnsi="Times New Roman" w:cs="Times New Roman" w:eastAsia="標楷體"/>
+          <w:b w:val="0"/>
+          <w:color w:val="17212B"/>
+          <w:sz w:val="22"/>
+        </w:rPr>
+        <w:t>。各模型的 a、b 路徑：</w:t>
+      </w:r>
+    </w:p>
+    <w:tbl>
+      <w:tblPr>
+        <w:tblStyle w:val="TableGrid"/>
+        <w:tblW w:type="auto" w:w="0"/>
+        <w:jc w:val="center"/>
+        <w:tblLook w:firstColumn="1" w:firstRow="1" w:lastColumn="0" w:lastRow="0" w:noHBand="0" w:noVBand="1" w:val="04A0"/>
+      </w:tblPr>
+      <w:tblGrid>
+        <w:gridCol w:w="3213"/>
+        <w:gridCol w:w="3213"/>
+        <w:gridCol w:w="3213"/>
+      </w:tblGrid>
+      <w:tr>
+        <w:trPr>
+          <w:cantSplit/>
+        </w:trPr>
+        <w:tc>
+          <w:tcPr>
+            <w:tcW w:type="dxa" w:w="2835"/>
+            <w:shd w:val="clear" w:fill="E6F2F0"/>
+          </w:tcPr>
+          <w:p>
+            <w:pPr>
+              <w:keepNext/>
+              <w:spacing w:before="0" w:after="0" w:line="260" w:lineRule="exact"/>
+              <w:jc w:val="left"/>
+            </w:pPr>
+            <w:r>
+              <w:rPr>
+                <w:rFonts w:ascii="Times New Roman" w:hAnsi="Times New Roman" w:cs="Times New Roman" w:eastAsia="標楷體"/>
+                <w:b/>
+                <w:color w:val="17212B"/>
+                <w:sz w:val="19"/>
+              </w:rPr>
+              <w:t>模型</w:t>
+            </w:r>
+          </w:p>
+        </w:tc>
+        <w:tc>
+          <w:tcPr>
+            <w:tcW w:type="dxa" w:w="3402"/>
+            <w:shd w:val="clear" w:fill="E6F2F0"/>
+          </w:tcPr>
+          <w:p>
+            <w:pPr>
+              <w:keepNext/>
+              <w:spacing w:before="0" w:after="0" w:line="260" w:lineRule="exact"/>
+              <w:jc w:val="center"/>
+            </w:pPr>
+            <w:r>
+              <w:rPr>
+                <w:rFonts w:ascii="Times New Roman" w:hAnsi="Times New Roman" w:cs="Times New Roman" w:eastAsia="標楷體"/>
+                <w:b/>
+                <w:color w:val="17212B"/>
+                <w:sz w:val="19"/>
+              </w:rPr>
+              <w:t>a 路徑（環境 → 中介）有成立的</w:t>
+            </w:r>
+          </w:p>
+        </w:tc>
+        <w:tc>
+          <w:tcPr>
+            <w:tcW w:type="dxa" w:w="3402"/>
+            <w:shd w:val="clear" w:fill="E6F2F0"/>
+          </w:tcPr>
+          <w:p>
+            <w:pPr>
+              <w:keepNext/>
+              <w:spacing w:before="0" w:after="0" w:line="260" w:lineRule="exact"/>
+              <w:jc w:val="center"/>
+            </w:pPr>
+            <w:r>
+              <w:rPr>
+                <w:rFonts w:ascii="Times New Roman" w:hAnsi="Times New Roman" w:cs="Times New Roman" w:eastAsia="標楷體"/>
+                <w:b/>
+                <w:color w:val="17212B"/>
+                <w:sz w:val="19"/>
+              </w:rPr>
+              <w:t>b 路徑（中介 → 結果）有成立的</w:t>
+            </w:r>
+          </w:p>
+        </w:tc>
+      </w:tr>
+      <w:tr>
+        <w:trPr>
+          <w:cantSplit/>
+        </w:trPr>
+        <w:tc>
+          <w:tcPr>
+            <w:tcW w:type="dxa" w:w="2835"/>
+          </w:tcPr>
+          <w:p>
+            <w:pPr>
+              <w:keepNext/>
+              <w:spacing w:before="0" w:after="0" w:line="260" w:lineRule="exact"/>
+              <w:jc w:val="left"/>
+            </w:pPr>
+            <w:r>
+              <w:rPr>
+                <w:rFonts w:ascii="Times New Roman" w:hAnsi="Times New Roman" w:cs="Times New Roman" w:eastAsia="標楷體"/>
+                <w:b w:val="0"/>
+                <w:color w:val="17212B"/>
+                <w:sz w:val="19"/>
+              </w:rPr>
+              <w:t>A 疲勞中介（96 人次）</w:t>
+            </w:r>
+          </w:p>
+        </w:tc>
+        <w:tc>
+          <w:tcPr>
+            <w:tcW w:type="dxa" w:w="3402"/>
+          </w:tcPr>
+          <w:p>
+            <w:pPr>
+              <w:keepNext/>
+              <w:spacing w:before="0" w:after="0" w:line="260" w:lineRule="exact"/>
+              <w:jc w:val="center"/>
+            </w:pPr>
+            <w:r>
+              <w:rPr>
+                <w:rFonts w:ascii="Times New Roman" w:hAnsi="Times New Roman" w:cs="Times New Roman" w:eastAsia="標楷體"/>
+                <w:b w:val="0"/>
+                <w:color w:val="17212B"/>
+                <w:sz w:val="19"/>
+              </w:rPr>
+              <w:t>無</w:t>
+            </w:r>
+          </w:p>
+        </w:tc>
+        <w:tc>
+          <w:tcPr>
+            <w:tcW w:type="dxa" w:w="3402"/>
+          </w:tcPr>
+          <w:p>
+            <w:pPr>
+              <w:keepNext/>
+              <w:spacing w:before="0" w:after="0" w:line="260" w:lineRule="exact"/>
+              <w:jc w:val="center"/>
+            </w:pPr>
+            <w:r>
+              <w:rPr>
+                <w:rFonts w:ascii="Times New Roman" w:hAnsi="Times New Roman" w:cs="Times New Roman" w:eastAsia="標楷體"/>
+                <w:b w:val="0"/>
+                <w:color w:val="17212B"/>
+                <w:sz w:val="19"/>
+              </w:rPr>
+              <w:t>無</w:t>
+            </w:r>
+          </w:p>
+        </w:tc>
+      </w:tr>
+      <w:tr>
+        <w:trPr>
+          <w:cantSplit/>
+        </w:trPr>
+        <w:tc>
+          <w:tcPr>
+            <w:tcW w:type="dxa" w:w="2835"/>
+          </w:tcPr>
+          <w:p>
+            <w:pPr>
+              <w:keepNext/>
+              <w:spacing w:before="0" w:after="0" w:line="260" w:lineRule="exact"/>
+              <w:jc w:val="left"/>
+            </w:pPr>
+            <w:r>
+              <w:rPr>
+                <w:rFonts w:ascii="Times New Roman" w:hAnsi="Times New Roman" w:cs="Times New Roman" w:eastAsia="標楷體"/>
+                <w:b w:val="0"/>
+                <w:color w:val="17212B"/>
+                <w:sz w:val="19"/>
+              </w:rPr>
+              <w:t>B1 心率中介（→ Stroop）（52 人次）</w:t>
+            </w:r>
+          </w:p>
+        </w:tc>
+        <w:tc>
+          <w:tcPr>
+            <w:tcW w:type="dxa" w:w="3402"/>
+          </w:tcPr>
+          <w:p>
+            <w:pPr>
+              <w:keepNext/>
+              <w:spacing w:before="0" w:after="0" w:line="260" w:lineRule="exact"/>
+              <w:jc w:val="center"/>
+            </w:pPr>
+            <w:r>
+              <w:rPr>
+                <w:rFonts w:ascii="Times New Roman" w:hAnsi="Times New Roman" w:cs="Times New Roman" w:eastAsia="標楷體"/>
+                <w:b w:val="0"/>
+                <w:color w:val="17212B"/>
+                <w:sz w:val="19"/>
+              </w:rPr>
+              <w:t>CO₂→瞬時心率 +0.77、濕度→瞬時心率 +0.49</w:t>
+            </w:r>
+          </w:p>
+        </w:tc>
+        <w:tc>
+          <w:tcPr>
+            <w:tcW w:type="dxa" w:w="3402"/>
+          </w:tcPr>
+          <w:p>
+            <w:pPr>
+              <w:keepNext/>
+              <w:spacing w:before="0" w:after="0" w:line="260" w:lineRule="exact"/>
+              <w:jc w:val="center"/>
+            </w:pPr>
+            <w:r>
+              <w:rPr>
+                <w:rFonts w:ascii="Times New Roman" w:hAnsi="Times New Roman" w:cs="Times New Roman" w:eastAsia="標楷體"/>
+                <w:b w:val="0"/>
+                <w:color w:val="17212B"/>
+                <w:sz w:val="19"/>
+              </w:rPr>
+              <w:t>無</w:t>
+            </w:r>
+          </w:p>
+        </w:tc>
+      </w:tr>
+      <w:tr>
+        <w:trPr>
+          <w:cantSplit/>
+        </w:trPr>
+        <w:tc>
+          <w:tcPr>
+            <w:tcW w:type="dxa" w:w="2835"/>
+          </w:tcPr>
+          <w:p>
+            <w:pPr>
+              <w:keepNext/>
+              <w:spacing w:before="0" w:after="0" w:line="260" w:lineRule="exact"/>
+              <w:jc w:val="left"/>
+            </w:pPr>
+            <w:r>
+              <w:rPr>
+                <w:rFonts w:ascii="Times New Roman" w:hAnsi="Times New Roman" w:cs="Times New Roman" w:eastAsia="標楷體"/>
+                <w:b w:val="0"/>
+                <w:color w:val="17212B"/>
+                <w:sz w:val="19"/>
+              </w:rPr>
+              <w:t>B2 心率中介（→ 疲勞）（46 人次）</w:t>
+            </w:r>
+          </w:p>
+        </w:tc>
+        <w:tc>
+          <w:tcPr>
+            <w:tcW w:type="dxa" w:w="3402"/>
+          </w:tcPr>
+          <w:p>
+            <w:pPr>
+              <w:keepNext/>
+              <w:spacing w:before="0" w:after="0" w:line="260" w:lineRule="exact"/>
+              <w:jc w:val="center"/>
+            </w:pPr>
+            <w:r>
+              <w:rPr>
+                <w:rFonts w:ascii="Times New Roman" w:hAnsi="Times New Roman" w:cs="Times New Roman" w:eastAsia="標楷體"/>
+                <w:b w:val="0"/>
+                <w:color w:val="17212B"/>
+                <w:sz w:val="19"/>
+              </w:rPr>
+              <w:t>CO₂→瞬時心率 +0.73、濕度→瞬時心率 +0.49</w:t>
+            </w:r>
+          </w:p>
+        </w:tc>
+        <w:tc>
+          <w:tcPr>
+            <w:tcW w:type="dxa" w:w="3402"/>
+          </w:tcPr>
+          <w:p>
+            <w:pPr>
+              <w:keepNext/>
+              <w:spacing w:before="0" w:after="0" w:line="260" w:lineRule="exact"/>
+              <w:jc w:val="center"/>
+            </w:pPr>
+            <w:r>
+              <w:rPr>
+                <w:rFonts w:ascii="Times New Roman" w:hAnsi="Times New Roman" w:cs="Times New Roman" w:eastAsia="標楷體"/>
+                <w:b w:val="0"/>
+                <w:color w:val="17212B"/>
+                <w:sz w:val="19"/>
+              </w:rPr>
+              <w:t>無</w:t>
+            </w:r>
+          </w:p>
+        </w:tc>
+      </w:tr>
+      <w:tr>
+        <w:trPr>
+          <w:cantSplit/>
+        </w:trPr>
+        <w:tc>
+          <w:tcPr>
+            <w:tcW w:type="dxa" w:w="2835"/>
+          </w:tcPr>
+          <w:p>
+            <w:pPr>
+              <w:spacing w:before="0" w:after="0" w:line="260" w:lineRule="exact"/>
+              <w:jc w:val="left"/>
+            </w:pPr>
+            <w:r>
+              <w:rPr>
+                <w:rFonts w:ascii="Times New Roman" w:hAnsi="Times New Roman" w:cs="Times New Roman" w:eastAsia="標楷體"/>
+                <w:b w:val="0"/>
+                <w:color w:val="17212B"/>
+                <w:sz w:val="19"/>
+              </w:rPr>
+              <w:t>C 心率 → 疲勞 序列中介（43 人次）</w:t>
+            </w:r>
+          </w:p>
+        </w:tc>
+        <w:tc>
+          <w:tcPr>
+            <w:tcW w:type="dxa" w:w="3402"/>
+          </w:tcPr>
+          <w:p>
+            <w:pPr>
+              <w:spacing w:before="0" w:after="0" w:line="260" w:lineRule="exact"/>
+              <w:jc w:val="center"/>
+            </w:pPr>
+            <w:r>
+              <w:rPr>
+                <w:rFonts w:ascii="Times New Roman" w:hAnsi="Times New Roman" w:cs="Times New Roman" w:eastAsia="標楷體"/>
+                <w:b w:val="0"/>
+                <w:color w:val="17212B"/>
+                <w:sz w:val="19"/>
+              </w:rPr>
+              <w:t>無</w:t>
+            </w:r>
+          </w:p>
+        </w:tc>
+        <w:tc>
+          <w:tcPr>
+            <w:tcW w:type="dxa" w:w="3402"/>
+          </w:tcPr>
+          <w:p>
+            <w:pPr>
+              <w:spacing w:before="0" w:after="0" w:line="260" w:lineRule="exact"/>
+              <w:jc w:val="center"/>
+            </w:pPr>
+            <w:r>
+              <w:rPr>
+                <w:rFonts w:ascii="Times New Roman" w:hAnsi="Times New Roman" w:cs="Times New Roman" w:eastAsia="標楷體"/>
+                <w:b w:val="0"/>
+                <w:color w:val="17212B"/>
+                <w:sz w:val="19"/>
+              </w:rPr>
+              <w:t>無</w:t>
+            </w:r>
+          </w:p>
+        </w:tc>
+      </w:tr>
+    </w:tbl>
+    <w:p>
+      <w:pPr>
+        <w:spacing w:after="40"/>
+      </w:pPr>
+    </w:p>
+    <w:p>
+      <w:pPr>
+        <w:spacing w:before="0" w:after="40" w:line="340" w:lineRule="exact"/>
+        <w:ind w:left="340" w:hanging="227"/>
+      </w:pPr>
+      <w:r>
+        <w:rPr>
+          <w:rFonts w:ascii="Times New Roman" w:hAnsi="Times New Roman" w:cs="Times New Roman" w:eastAsia="標楷體"/>
+          <w:b w:val="0"/>
+          <w:color w:val="17212B"/>
+          <w:sz w:val="21"/>
+        </w:rPr>
+        <w:t>・</w:t>
+      </w:r>
+      <w:r>
+        <w:rPr>
+          <w:rFonts w:ascii="Times New Roman" w:hAnsi="Times New Roman" w:cs="Times New Roman" w:eastAsia="標楷體"/>
+          <w:b/>
+          <w:color w:val="17212B"/>
+          <w:sz w:val="21"/>
+        </w:rPr>
+        <w:t>疲勞中介（樣本足夠）</w:t>
+      </w:r>
+      <w:r>
+        <w:rPr>
+          <w:rFonts w:ascii="Times New Roman" w:hAnsi="Times New Roman" w:cs="Times New Roman" w:eastAsia="標楷體"/>
+          <w:b w:val="0"/>
+          <w:color w:val="17212B"/>
+          <w:sz w:val="21"/>
+        </w:rPr>
+        <w:t>：環境 → 疲勞（a）與疲勞 → Stroop（b）都不成立，所以 CO₂ 沒有透過疲勞影響 Stroop。CO₂ 對反應時間的效果是直接效果（β = +0.29），沒有經過疲勞。</w:t>
+      </w:r>
+    </w:p>
+    <w:p>
+      <w:pPr>
+        <w:spacing w:before="0" w:after="40" w:line="340" w:lineRule="exact"/>
+        <w:ind w:left="340" w:hanging="227"/>
+      </w:pPr>
+      <w:r>
+        <w:rPr>
+          <w:rFonts w:ascii="Times New Roman" w:hAnsi="Times New Roman" w:cs="Times New Roman" w:eastAsia="標楷體"/>
+          <w:b w:val="0"/>
+          <w:color w:val="17212B"/>
+          <w:sz w:val="21"/>
+        </w:rPr>
+        <w:t>・</w:t>
+      </w:r>
+      <w:r>
+        <w:rPr>
+          <w:rFonts w:ascii="Times New Roman" w:hAnsi="Times New Roman" w:cs="Times New Roman" w:eastAsia="標楷體"/>
+          <w:b/>
+          <w:color w:val="17212B"/>
+          <w:sz w:val="21"/>
+        </w:rPr>
+        <w:t>心率中介（樣本偏小）</w:t>
+      </w:r>
+      <w:r>
+        <w:rPr>
+          <w:rFonts w:ascii="Times New Roman" w:hAnsi="Times New Roman" w:cs="Times New Roman" w:eastAsia="標楷體"/>
+          <w:b w:val="0"/>
+          <w:color w:val="17212B"/>
+          <w:sz w:val="21"/>
+        </w:rPr>
+        <w:t>：環境 → 心率（a）有成立（CO₂、濕度越高，該節平均心率越高），但心率 → Stroop、心率 → 疲勞（b）都不成立，所以中介不成立。</w:t>
+      </w:r>
+    </w:p>
+    <w:p>
+      <w:pPr>
+        <w:spacing w:before="0" w:after="40" w:line="340" w:lineRule="exact"/>
+        <w:ind w:left="340" w:hanging="227"/>
+      </w:pPr>
+      <w:r>
+        <w:rPr>
+          <w:rFonts w:ascii="Times New Roman" w:hAnsi="Times New Roman" w:cs="Times New Roman" w:eastAsia="標楷體"/>
+          <w:b w:val="0"/>
+          <w:color w:val="17212B"/>
+          <w:sz w:val="21"/>
+        </w:rPr>
+        <w:t>・</w:t>
+      </w:r>
+      <w:r>
+        <w:rPr>
+          <w:rFonts w:ascii="Times New Roman" w:hAnsi="Times New Roman" w:cs="Times New Roman" w:eastAsia="標楷體"/>
+          <w:b/>
+          <w:color w:val="17212B"/>
+          <w:sz w:val="21"/>
+        </w:rPr>
+        <w:t>序列中介</w:t>
+      </w:r>
+      <w:r>
+        <w:rPr>
+          <w:rFonts w:ascii="Times New Roman" w:hAnsi="Times New Roman" w:cs="Times New Roman" w:eastAsia="標楷體"/>
+          <w:b w:val="0"/>
+          <w:color w:val="17212B"/>
+          <w:sz w:val="21"/>
+        </w:rPr>
+        <w:t>：環境 → 心率 → 疲勞 → Stroop 每一段都不成立。</w:t>
+      </w:r>
+    </w:p>
+    <w:p>
+      <w:pPr>
+        <w:spacing w:before="0" w:after="40" w:line="340" w:lineRule="exact"/>
+        <w:ind w:left="340" w:hanging="227"/>
+      </w:pPr>
+      <w:r>
+        <w:rPr>
+          <w:rFonts w:ascii="Times New Roman" w:hAnsi="Times New Roman" w:cs="Times New Roman" w:eastAsia="標楷體"/>
+          <w:b w:val="0"/>
+          <w:color w:val="17212B"/>
+          <w:sz w:val="21"/>
+        </w:rPr>
+        <w:t>・結論：目前資料中，找不到環境透過疲勞或心率影響認知表現的中介路徑；斷在「中介 → 結果」這一段。心率相關的模型只有 43–52 人次，只能偵測較大的效果，較小的中介效果可能存在但測不到。</w:t>
+      </w:r>
+    </w:p>
+    <w:p>
+      <w:pPr>
+        <w:spacing w:before="0" w:after="40" w:line="340" w:lineRule="exact"/>
+        <w:ind w:left="340" w:hanging="227"/>
+      </w:pPr>
+      <w:r>
+        <w:rPr>
+          <w:rFonts w:ascii="Times New Roman" w:hAnsi="Times New Roman" w:cs="Times New Roman" w:eastAsia="標楷體"/>
+          <w:b w:val="0"/>
+          <w:color w:val="17212B"/>
+          <w:sz w:val="21"/>
+        </w:rPr>
+        <w:t>・注意：這裡的心率是「整節課的平均」，與前面每 5 分鐘一筆的 LMM 不同，所以 CO₂ 對心率的方向不能直接比較。</w:t>
+      </w:r>
+    </w:p>
     <w:sectPr>
       <w:pgSz w:w="11906" w:h="16838"/>
       <w:pgMar w:top="1134" w:right="1134" w:bottom="1134" w:left="1134" w:header="720" w:footer="720" w:gutter="0"/>

</xml_diff>